<commit_message>
continuer diagramme de sequence
</commit_message>
<xml_diff>
--- a/projet_memoire.docx
+++ b/projet_memoire.docx
@@ -25480,7 +25480,23 @@
           <w:sz w:val="24"/>
           <w:szCs w:val="24"/>
         </w:rPr>
-        <w:t xml:space="preserve">Diagramme de Gérer ses rendez-vous </w:t>
+        <w:t xml:space="preserve">Diagramme de </w:t>
+      </w:r>
+      <w:r>
+        <w:rPr>
+          <w:rFonts w:ascii="Times New Roman" w:hAnsi="Times New Roman" w:cs="Times New Roman"/>
+          <w:sz w:val="24"/>
+          <w:szCs w:val="24"/>
+        </w:rPr>
+        <w:t xml:space="preserve">Séquence de Gérer </w:t>
+      </w:r>
+      <w:r>
+        <w:rPr>
+          <w:rFonts w:ascii="Times New Roman" w:hAnsi="Times New Roman" w:cs="Times New Roman"/>
+          <w:sz w:val="24"/>
+          <w:szCs w:val="24"/>
+        </w:rPr>
+        <w:t xml:space="preserve">rendez-vous </w:t>
       </w:r>
     </w:p>
     <w:p>
@@ -25506,9 +25522,9 @@
         <w:lastRenderedPageBreak/>
         <w:drawing>
           <wp:inline distT="0" distB="0" distL="0" distR="0">
-            <wp:extent cx="5190490" cy="9937115"/>
-            <wp:effectExtent l="0" t="0" r="0" b="6985"/>
-            <wp:docPr id="3" name="Image 3" descr="D:\l3\Memoire_De_Fin_Cycle\photo\prise de rdv.jpg"/>
+            <wp:extent cx="5289550" cy="9429750"/>
+            <wp:effectExtent l="0" t="0" r="6350" b="0"/>
+            <wp:docPr id="17" name="Image 17" descr="D:\l3\Memoire_De_Fin_Cycle\photo\cli.png"/>
             <wp:cNvGraphicFramePr>
               <a:graphicFrameLocks xmlns:a="http://schemas.openxmlformats.org/drawingml/2006/main" noChangeAspect="1"/>
             </wp:cNvGraphicFramePr>
@@ -25516,7 +25532,7 @@
               <a:graphicData uri="http://schemas.openxmlformats.org/drawingml/2006/picture">
                 <pic:pic xmlns:pic="http://schemas.openxmlformats.org/drawingml/2006/picture">
                   <pic:nvPicPr>
-                    <pic:cNvPr id="0" name="Picture 2" descr="D:\l3\Memoire_De_Fin_Cycle\photo\prise de rdv.jpg"/>
+                    <pic:cNvPr id="0" name="Picture 9" descr="D:\l3\Memoire_De_Fin_Cycle\photo\cli.png"/>
                     <pic:cNvPicPr>
                       <a:picLocks noChangeAspect="1" noChangeArrowheads="1"/>
                     </pic:cNvPicPr>
@@ -25537,7 +25553,7 @@
                   <pic:spPr bwMode="auto">
                     <a:xfrm>
                       <a:off x="0" y="0"/>
-                      <a:ext cx="5190490" cy="9937115"/>
+                      <a:ext cx="5289550" cy="9429750"/>
                     </a:xfrm>
                     <a:prstGeom prst="rect">
                       <a:avLst/>
@@ -26180,8 +26196,6 @@
           <w:lang w:eastAsia="fr-FR"/>
         </w:rPr>
       </w:pPr>
-      <w:bookmarkStart w:id="0" w:name="_GoBack"/>
-      <w:bookmarkEnd w:id="0"/>
       <w:r>
         <w:rPr>
           <w:rFonts w:ascii="Times New Roman" w:eastAsia="Times New Roman" w:hAnsi="Times New Roman" w:cs="Times New Roman"/>
@@ -26362,14 +26376,6 @@
           <w:szCs w:val="24"/>
         </w:rPr>
       </w:pPr>
-      <w:r>
-        <w:rPr>
-          <w:rFonts w:ascii="Times New Roman" w:hAnsi="Times New Roman" w:cs="Times New Roman"/>
-          <w:sz w:val="24"/>
-          <w:szCs w:val="24"/>
-        </w:rPr>
-        <w:t>Description :</w:t>
-      </w:r>
     </w:p>
     <w:p>
       <w:pPr>
@@ -26389,7 +26395,15 @@
           <w:sz w:val="24"/>
           <w:szCs w:val="24"/>
         </w:rPr>
-        <w:t>Premier Partie : Identification</w:t>
+        <w:t xml:space="preserve">Diagramme de Séquence de Gérer </w:t>
+      </w:r>
+      <w:r>
+        <w:rPr>
+          <w:rFonts w:ascii="Times New Roman" w:hAnsi="Times New Roman" w:cs="Times New Roman"/>
+          <w:sz w:val="24"/>
+          <w:szCs w:val="24"/>
+        </w:rPr>
+        <w:t>cycle intervention</w:t>
       </w:r>
     </w:p>
     <w:p>
@@ -26404,14 +26418,6 @@
           <w:szCs w:val="24"/>
         </w:rPr>
       </w:pPr>
-      <w:r>
-        <w:rPr>
-          <w:rFonts w:ascii="Times New Roman" w:hAnsi="Times New Roman" w:cs="Times New Roman"/>
-          <w:sz w:val="24"/>
-          <w:szCs w:val="24"/>
-        </w:rPr>
-        <w:t>Nom : Gérer cycle intervention</w:t>
-      </w:r>
     </w:p>
     <w:p>
       <w:pPr>
@@ -26425,14 +26431,6 @@
           <w:szCs w:val="24"/>
         </w:rPr>
       </w:pPr>
-      <w:r>
-        <w:rPr>
-          <w:rFonts w:ascii="Times New Roman" w:hAnsi="Times New Roman" w:cs="Times New Roman"/>
-          <w:sz w:val="24"/>
-          <w:szCs w:val="24"/>
-        </w:rPr>
-        <w:t xml:space="preserve">Acteur : réceptionniste </w:t>
-      </w:r>
     </w:p>
     <w:p>
       <w:pPr>
@@ -26449,58 +26447,60 @@
       <w:r>
         <w:rPr>
           <w:rFonts w:ascii="Times New Roman" w:hAnsi="Times New Roman" w:cs="Times New Roman"/>
-          <w:sz w:val="24"/>
-          <w:szCs w:val="24"/>
-        </w:rPr>
-        <w:t xml:space="preserve">Objectif : </w:t>
-      </w:r>
-      <w:r>
-        <w:rPr>
-          <w:rFonts w:ascii="Times New Roman" w:hAnsi="Times New Roman" w:cs="Times New Roman"/>
-          <w:sz w:val="24"/>
-          <w:szCs w:val="24"/>
-        </w:rPr>
-        <w:t>p</w:t>
-      </w:r>
-      <w:r>
-        <w:rPr>
-          <w:rFonts w:ascii="Times New Roman" w:hAnsi="Times New Roman" w:cs="Times New Roman"/>
-          <w:sz w:val="24"/>
-          <w:szCs w:val="24"/>
-        </w:rPr>
-        <w:t>e</w:t>
-      </w:r>
-      <w:r>
-        <w:rPr>
-          <w:rFonts w:ascii="Times New Roman" w:hAnsi="Times New Roman" w:cs="Times New Roman"/>
-          <w:sz w:val="24"/>
-          <w:szCs w:val="24"/>
-        </w:rPr>
-        <w:t>rmet au</w:t>
-      </w:r>
-      <w:r>
-        <w:rPr>
-          <w:rFonts w:ascii="Times New Roman" w:hAnsi="Times New Roman" w:cs="Times New Roman"/>
-          <w:sz w:val="24"/>
-          <w:szCs w:val="24"/>
-        </w:rPr>
-        <w:t xml:space="preserve"> </w:t>
-      </w:r>
-      <w:r>
-        <w:rPr>
-          <w:rFonts w:ascii="Times New Roman" w:hAnsi="Times New Roman" w:cs="Times New Roman"/>
-          <w:sz w:val="24"/>
-          <w:szCs w:val="24"/>
-        </w:rPr>
-        <w:t xml:space="preserve">réceptionniste </w:t>
-      </w:r>
-      <w:r>
-        <w:rPr>
-          <w:rFonts w:ascii="Times New Roman" w:hAnsi="Times New Roman" w:cs="Times New Roman"/>
-          <w:sz w:val="24"/>
-          <w:szCs w:val="24"/>
-        </w:rPr>
-        <w:t>de créer une intervention, de la suivre jusqu’à la génération d’une facture.</w:t>
+          <w:noProof/>
+          <w:sz w:val="24"/>
+          <w:szCs w:val="24"/>
+          <w:lang w:eastAsia="fr-FR"/>
+        </w:rPr>
+        <w:lastRenderedPageBreak/>
+        <w:drawing>
+          <wp:inline distT="0" distB="0" distL="0" distR="0">
+            <wp:extent cx="5372100" cy="9194800"/>
+            <wp:effectExtent l="0" t="0" r="0" b="6350"/>
+            <wp:docPr id="16" name="Image 16" descr="D:\l3\Memoire_De_Fin_Cycle\photo\rec.png"/>
+            <wp:cNvGraphicFramePr>
+              <a:graphicFrameLocks xmlns:a="http://schemas.openxmlformats.org/drawingml/2006/main" noChangeAspect="1"/>
+            </wp:cNvGraphicFramePr>
+            <a:graphic xmlns:a="http://schemas.openxmlformats.org/drawingml/2006/main">
+              <a:graphicData uri="http://schemas.openxmlformats.org/drawingml/2006/picture">
+                <pic:pic xmlns:pic="http://schemas.openxmlformats.org/drawingml/2006/picture">
+                  <pic:nvPicPr>
+                    <pic:cNvPr id="0" name="Picture 8" descr="D:\l3\Memoire_De_Fin_Cycle\photo\rec.png"/>
+                    <pic:cNvPicPr>
+                      <a:picLocks noChangeAspect="1" noChangeArrowheads="1"/>
+                    </pic:cNvPicPr>
+                  </pic:nvPicPr>
+                  <pic:blipFill>
+                    <a:blip r:embed="rId14">
+                      <a:extLst>
+                        <a:ext uri="{28A0092B-C50C-407E-A947-70E740481C1C}">
+                          <a14:useLocalDpi xmlns:a14="http://schemas.microsoft.com/office/drawing/2010/main" val="0"/>
+                        </a:ext>
+                      </a:extLst>
+                    </a:blip>
+                    <a:srcRect/>
+                    <a:stretch>
+                      <a:fillRect/>
+                    </a:stretch>
+                  </pic:blipFill>
+                  <pic:spPr bwMode="auto">
+                    <a:xfrm>
+                      <a:off x="0" y="0"/>
+                      <a:ext cx="5372100" cy="9194800"/>
+                    </a:xfrm>
+                    <a:prstGeom prst="rect">
+                      <a:avLst/>
+                    </a:prstGeom>
+                    <a:noFill/>
+                    <a:ln>
+                      <a:noFill/>
+                    </a:ln>
+                  </pic:spPr>
+                </pic:pic>
+              </a:graphicData>
+            </a:graphic>
+          </wp:inline>
+        </w:drawing>
       </w:r>
     </w:p>
     <w:p>
@@ -26515,14 +26515,6 @@
           <w:szCs w:val="24"/>
         </w:rPr>
       </w:pPr>
-      <w:r>
-        <w:rPr>
-          <w:rFonts w:ascii="Times New Roman" w:hAnsi="Times New Roman" w:cs="Times New Roman"/>
-          <w:sz w:val="24"/>
-          <w:szCs w:val="24"/>
-        </w:rPr>
-        <w:t>Deuxième partie : Description Scenario</w:t>
-      </w:r>
     </w:p>
     <w:p>
       <w:pPr>
@@ -26542,45 +26534,7 @@
           <w:sz w:val="24"/>
           <w:szCs w:val="24"/>
         </w:rPr>
-        <w:t xml:space="preserve">Précondition : </w:t>
-      </w:r>
-      <w:r>
-        <w:rPr>
-          <w:sz w:val="24"/>
-          <w:szCs w:val="24"/>
-        </w:rPr>
-        <w:t xml:space="preserve">le système doit garantir un état de </w:t>
-      </w:r>
-      <w:r>
-        <w:rPr>
-          <w:bCs/>
-          <w:sz w:val="24"/>
-          <w:szCs w:val="24"/>
-        </w:rPr>
-        <w:t>disponibilité immédiate</w:t>
-      </w:r>
-      <w:r>
-        <w:rPr>
-          <w:sz w:val="24"/>
-          <w:szCs w:val="24"/>
-        </w:rPr>
-        <w:t xml:space="preserve"> et de </w:t>
-      </w:r>
-      <w:r>
-        <w:rPr>
-          <w:bCs/>
-          <w:sz w:val="24"/>
-          <w:szCs w:val="24"/>
-        </w:rPr>
-        <w:t>sécurité</w:t>
-      </w:r>
-      <w:r>
-        <w:rPr>
-          <w:rFonts w:ascii="Times New Roman" w:hAnsi="Times New Roman" w:cs="Times New Roman"/>
-          <w:sz w:val="24"/>
-          <w:szCs w:val="24"/>
-        </w:rPr>
-        <w:t xml:space="preserve">. </w:t>
+        <w:t>Description :</w:t>
       </w:r>
     </w:p>
     <w:p>
@@ -26601,7 +26555,7 @@
           <w:sz w:val="24"/>
           <w:szCs w:val="24"/>
         </w:rPr>
-        <w:t>L’enchainement des messages :</w:t>
+        <w:t>Premier Partie : Identification</w:t>
       </w:r>
     </w:p>
     <w:p>
@@ -26622,7 +26576,218 @@
           <w:sz w:val="24"/>
           <w:szCs w:val="24"/>
         </w:rPr>
-        <w:lastRenderedPageBreak/>
+        <w:t>Nom : Gérer cycle intervention</w:t>
+      </w:r>
+    </w:p>
+    <w:p>
+      <w:pPr>
+        <w:tabs>
+          <w:tab w:val="left" w:pos="5560"/>
+        </w:tabs>
+        <w:ind w:left="360"/>
+        <w:rPr>
+          <w:rFonts w:ascii="Times New Roman" w:hAnsi="Times New Roman" w:cs="Times New Roman"/>
+          <w:sz w:val="24"/>
+          <w:szCs w:val="24"/>
+        </w:rPr>
+      </w:pPr>
+      <w:r>
+        <w:rPr>
+          <w:rFonts w:ascii="Times New Roman" w:hAnsi="Times New Roman" w:cs="Times New Roman"/>
+          <w:sz w:val="24"/>
+          <w:szCs w:val="24"/>
+        </w:rPr>
+        <w:t xml:space="preserve">Acteur : réceptionniste </w:t>
+      </w:r>
+    </w:p>
+    <w:p>
+      <w:pPr>
+        <w:tabs>
+          <w:tab w:val="left" w:pos="5560"/>
+        </w:tabs>
+        <w:ind w:left="360"/>
+        <w:rPr>
+          <w:rFonts w:ascii="Times New Roman" w:hAnsi="Times New Roman" w:cs="Times New Roman"/>
+          <w:sz w:val="24"/>
+          <w:szCs w:val="24"/>
+        </w:rPr>
+      </w:pPr>
+      <w:r>
+        <w:rPr>
+          <w:rFonts w:ascii="Times New Roman" w:hAnsi="Times New Roman" w:cs="Times New Roman"/>
+          <w:sz w:val="24"/>
+          <w:szCs w:val="24"/>
+        </w:rPr>
+        <w:t xml:space="preserve">Objectif : </w:t>
+      </w:r>
+      <w:r>
+        <w:rPr>
+          <w:rFonts w:ascii="Times New Roman" w:hAnsi="Times New Roman" w:cs="Times New Roman"/>
+          <w:sz w:val="24"/>
+          <w:szCs w:val="24"/>
+        </w:rPr>
+        <w:t>p</w:t>
+      </w:r>
+      <w:r>
+        <w:rPr>
+          <w:rFonts w:ascii="Times New Roman" w:hAnsi="Times New Roman" w:cs="Times New Roman"/>
+          <w:sz w:val="24"/>
+          <w:szCs w:val="24"/>
+        </w:rPr>
+        <w:t>e</w:t>
+      </w:r>
+      <w:r>
+        <w:rPr>
+          <w:rFonts w:ascii="Times New Roman" w:hAnsi="Times New Roman" w:cs="Times New Roman"/>
+          <w:sz w:val="24"/>
+          <w:szCs w:val="24"/>
+        </w:rPr>
+        <w:t>rmet au</w:t>
+      </w:r>
+      <w:r>
+        <w:rPr>
+          <w:rFonts w:ascii="Times New Roman" w:hAnsi="Times New Roman" w:cs="Times New Roman"/>
+          <w:sz w:val="24"/>
+          <w:szCs w:val="24"/>
+        </w:rPr>
+        <w:t xml:space="preserve"> </w:t>
+      </w:r>
+      <w:r>
+        <w:rPr>
+          <w:rFonts w:ascii="Times New Roman" w:hAnsi="Times New Roman" w:cs="Times New Roman"/>
+          <w:sz w:val="24"/>
+          <w:szCs w:val="24"/>
+        </w:rPr>
+        <w:t xml:space="preserve">réceptionniste </w:t>
+      </w:r>
+      <w:r>
+        <w:rPr>
+          <w:rFonts w:ascii="Times New Roman" w:hAnsi="Times New Roman" w:cs="Times New Roman"/>
+          <w:sz w:val="24"/>
+          <w:szCs w:val="24"/>
+        </w:rPr>
+        <w:t>de créer une intervention, de la suivre jusqu’à la génération d’une facture.</w:t>
+      </w:r>
+    </w:p>
+    <w:p>
+      <w:pPr>
+        <w:tabs>
+          <w:tab w:val="left" w:pos="5560"/>
+        </w:tabs>
+        <w:ind w:left="360"/>
+        <w:rPr>
+          <w:rFonts w:ascii="Times New Roman" w:hAnsi="Times New Roman" w:cs="Times New Roman"/>
+          <w:sz w:val="24"/>
+          <w:szCs w:val="24"/>
+        </w:rPr>
+      </w:pPr>
+      <w:r>
+        <w:rPr>
+          <w:rFonts w:ascii="Times New Roman" w:hAnsi="Times New Roman" w:cs="Times New Roman"/>
+          <w:sz w:val="24"/>
+          <w:szCs w:val="24"/>
+        </w:rPr>
+        <w:t>Deuxième partie : Description Scenario</w:t>
+      </w:r>
+    </w:p>
+    <w:p>
+      <w:pPr>
+        <w:tabs>
+          <w:tab w:val="left" w:pos="5560"/>
+        </w:tabs>
+        <w:ind w:left="360"/>
+        <w:rPr>
+          <w:rFonts w:ascii="Times New Roman" w:hAnsi="Times New Roman" w:cs="Times New Roman"/>
+          <w:sz w:val="24"/>
+          <w:szCs w:val="24"/>
+        </w:rPr>
+      </w:pPr>
+      <w:r>
+        <w:rPr>
+          <w:rFonts w:ascii="Times New Roman" w:hAnsi="Times New Roman" w:cs="Times New Roman"/>
+          <w:sz w:val="24"/>
+          <w:szCs w:val="24"/>
+        </w:rPr>
+        <w:t xml:space="preserve">Précondition : </w:t>
+      </w:r>
+      <w:r>
+        <w:rPr>
+          <w:sz w:val="24"/>
+          <w:szCs w:val="24"/>
+        </w:rPr>
+        <w:t xml:space="preserve">le système doit garantir un état de </w:t>
+      </w:r>
+      <w:r>
+        <w:rPr>
+          <w:bCs/>
+          <w:sz w:val="24"/>
+          <w:szCs w:val="24"/>
+        </w:rPr>
+        <w:t>disponibilité immédiate</w:t>
+      </w:r>
+      <w:r>
+        <w:rPr>
+          <w:sz w:val="24"/>
+          <w:szCs w:val="24"/>
+        </w:rPr>
+        <w:t xml:space="preserve"> et de </w:t>
+      </w:r>
+      <w:r>
+        <w:rPr>
+          <w:bCs/>
+          <w:sz w:val="24"/>
+          <w:szCs w:val="24"/>
+        </w:rPr>
+        <w:t>sécurité</w:t>
+      </w:r>
+      <w:r>
+        <w:rPr>
+          <w:rFonts w:ascii="Times New Roman" w:hAnsi="Times New Roman" w:cs="Times New Roman"/>
+          <w:sz w:val="24"/>
+          <w:szCs w:val="24"/>
+        </w:rPr>
+        <w:t xml:space="preserve">. </w:t>
+      </w:r>
+    </w:p>
+    <w:p>
+      <w:pPr>
+        <w:tabs>
+          <w:tab w:val="left" w:pos="5560"/>
+        </w:tabs>
+        <w:ind w:left="360"/>
+        <w:rPr>
+          <w:rFonts w:ascii="Times New Roman" w:hAnsi="Times New Roman" w:cs="Times New Roman"/>
+          <w:sz w:val="24"/>
+          <w:szCs w:val="24"/>
+        </w:rPr>
+      </w:pPr>
+      <w:r>
+        <w:rPr>
+          <w:rFonts w:ascii="Times New Roman" w:hAnsi="Times New Roman" w:cs="Times New Roman"/>
+          <w:sz w:val="24"/>
+          <w:szCs w:val="24"/>
+        </w:rPr>
+        <w:t>L’enchainement des messages :</w:t>
+      </w:r>
+    </w:p>
+    <w:p>
+      <w:pPr>
+        <w:tabs>
+          <w:tab w:val="left" w:pos="5560"/>
+        </w:tabs>
+        <w:ind w:left="360"/>
+        <w:rPr>
+          <w:rFonts w:ascii="Times New Roman" w:hAnsi="Times New Roman" w:cs="Times New Roman"/>
+          <w:sz w:val="24"/>
+          <w:szCs w:val="24"/>
+        </w:rPr>
+      </w:pPr>
+      <w:r>
+        <w:rPr>
+          <w:rFonts w:ascii="Times New Roman" w:hAnsi="Times New Roman" w:cs="Times New Roman"/>
+          <w:sz w:val="24"/>
+          <w:szCs w:val="24"/>
+        </w:rPr>
         <w:t>Le réceptionniste saisit ses identifiants</w:t>
       </w:r>
     </w:p>
@@ -27113,7 +27278,7 @@
                     </pic:cNvPicPr>
                   </pic:nvPicPr>
                   <pic:blipFill>
-                    <a:blip r:embed="rId14">
+                    <a:blip r:embed="rId15">
                       <a:extLst>
                         <a:ext uri="{28A0092B-C50C-407E-A947-70E740481C1C}">
                           <a14:useLocalDpi xmlns:a14="http://schemas.microsoft.com/office/drawing/2010/main" val="0"/>
@@ -27170,14 +27335,6 @@
           <w:szCs w:val="24"/>
         </w:rPr>
       </w:pPr>
-      <w:r>
-        <w:rPr>
-          <w:rFonts w:ascii="Times New Roman" w:hAnsi="Times New Roman" w:cs="Times New Roman"/>
-          <w:sz w:val="24"/>
-          <w:szCs w:val="24"/>
-        </w:rPr>
-        <w:t>Description :</w:t>
-      </w:r>
     </w:p>
     <w:p>
       <w:pPr>
@@ -27185,10 +27342,12 @@
           <w:tab w:val="left" w:pos="5560"/>
         </w:tabs>
         <w:ind w:left="360"/>
-      </w:pPr>
-      <w:r>
-        <w:t>Le chef de département saisit ses identifiants</w:t>
-      </w:r>
+        <w:rPr>
+          <w:rFonts w:ascii="Times New Roman" w:hAnsi="Times New Roman" w:cs="Times New Roman"/>
+          <w:sz w:val="24"/>
+          <w:szCs w:val="24"/>
+        </w:rPr>
+      </w:pPr>
     </w:p>
     <w:p>
       <w:pPr>
@@ -27196,10 +27355,80 @@
           <w:tab w:val="left" w:pos="5560"/>
         </w:tabs>
         <w:ind w:left="360"/>
-      </w:pPr>
-      <w:r>
-        <w:t>Le système lui accorde l'accès</w:t>
-      </w:r>
+        <w:rPr>
+          <w:rFonts w:ascii="Times New Roman" w:hAnsi="Times New Roman" w:cs="Times New Roman"/>
+          <w:sz w:val="24"/>
+          <w:szCs w:val="24"/>
+        </w:rPr>
+      </w:pPr>
+      <w:r>
+        <w:rPr>
+          <w:rFonts w:ascii="Times New Roman" w:hAnsi="Times New Roman" w:cs="Times New Roman"/>
+          <w:noProof/>
+          <w:sz w:val="24"/>
+          <w:szCs w:val="24"/>
+          <w:lang w:eastAsia="fr-FR"/>
+        </w:rPr>
+        <w:lastRenderedPageBreak/>
+        <w:drawing>
+          <wp:inline distT="0" distB="0" distL="0" distR="0">
+            <wp:extent cx="5715000" cy="9480550"/>
+            <wp:effectExtent l="0" t="0" r="0" b="6350"/>
+            <wp:docPr id="20" name="Image 20" descr="D:\l3\Memoire_De_Fin_Cycle\photo\cd1.png"/>
+            <wp:cNvGraphicFramePr>
+              <a:graphicFrameLocks xmlns:a="http://schemas.openxmlformats.org/drawingml/2006/main" noChangeAspect="1"/>
+            </wp:cNvGraphicFramePr>
+            <a:graphic xmlns:a="http://schemas.openxmlformats.org/drawingml/2006/main">
+              <a:graphicData uri="http://schemas.openxmlformats.org/drawingml/2006/picture">
+                <pic:pic xmlns:pic="http://schemas.openxmlformats.org/drawingml/2006/picture">
+                  <pic:nvPicPr>
+                    <pic:cNvPr id="0" name="Picture 11" descr="D:\l3\Memoire_De_Fin_Cycle\photo\cd1.png"/>
+                    <pic:cNvPicPr>
+                      <a:picLocks noChangeAspect="1" noChangeArrowheads="1"/>
+                    </pic:cNvPicPr>
+                  </pic:nvPicPr>
+                  <pic:blipFill>
+                    <a:blip r:embed="rId16">
+                      <a:extLst>
+                        <a:ext uri="{28A0092B-C50C-407E-A947-70E740481C1C}">
+                          <a14:useLocalDpi xmlns:a14="http://schemas.microsoft.com/office/drawing/2010/main" val="0"/>
+                        </a:ext>
+                      </a:extLst>
+                    </a:blip>
+                    <a:srcRect/>
+                    <a:stretch>
+                      <a:fillRect/>
+                    </a:stretch>
+                  </pic:blipFill>
+                  <pic:spPr bwMode="auto">
+                    <a:xfrm>
+                      <a:off x="0" y="0"/>
+                      <a:ext cx="5715000" cy="9480550"/>
+                    </a:xfrm>
+                    <a:prstGeom prst="rect">
+                      <a:avLst/>
+                    </a:prstGeom>
+                    <a:noFill/>
+                    <a:ln>
+                      <a:noFill/>
+                    </a:ln>
+                  </pic:spPr>
+                </pic:pic>
+              </a:graphicData>
+            </a:graphic>
+          </wp:inline>
+        </w:drawing>
+      </w:r>
+      <w:r>
+        <w:rPr>
+          <w:rFonts w:ascii="Times New Roman" w:hAnsi="Times New Roman" w:cs="Times New Roman"/>
+          <w:sz w:val="24"/>
+          <w:szCs w:val="24"/>
+        </w:rPr>
+        <w:t xml:space="preserve"> </w:t>
+      </w:r>
+      <w:bookmarkStart w:id="0" w:name="_GoBack"/>
+      <w:bookmarkEnd w:id="0"/>
     </w:p>
     <w:p>
       <w:pPr>
@@ -27207,9 +27436,20 @@
           <w:tab w:val="left" w:pos="5560"/>
         </w:tabs>
         <w:ind w:left="360"/>
-      </w:pPr>
-      <w:r>
-        <w:t>Le chef consulte l'intervention en cours</w:t>
+        <w:rPr>
+          <w:rFonts w:ascii="Times New Roman" w:hAnsi="Times New Roman" w:cs="Times New Roman"/>
+          <w:sz w:val="24"/>
+          <w:szCs w:val="24"/>
+        </w:rPr>
+      </w:pPr>
+      <w:r>
+        <w:rPr>
+          <w:rFonts w:ascii="Times New Roman" w:hAnsi="Times New Roman" w:cs="Times New Roman"/>
+          <w:sz w:val="24"/>
+          <w:szCs w:val="24"/>
+        </w:rPr>
+        <w:lastRenderedPageBreak/>
+        <w:t>Description :</w:t>
       </w:r>
     </w:p>
     <w:p>
@@ -27220,7 +27460,7 @@
         <w:ind w:left="360"/>
       </w:pPr>
       <w:r>
-        <w:t>Le système affiche les détails (diagnostic, travaux prévus)</w:t>
+        <w:t>Le chef de département saisit ses identifiants</w:t>
       </w:r>
     </w:p>
     <w:p>
@@ -27231,7 +27471,7 @@
         <w:ind w:left="360"/>
       </w:pPr>
       <w:r>
-        <w:t>Le chef ajuste le diagnostic suite à un problème découvert pendant les travaux</w:t>
+        <w:t>Le système lui accorde l'accès</w:t>
       </w:r>
     </w:p>
     <w:p>
@@ -27242,7 +27482,7 @@
         <w:ind w:left="360"/>
       </w:pPr>
       <w:r>
-        <w:t>Le système confirme l'ajustement</w:t>
+        <w:t>Le chef consulte l'intervention en cours</w:t>
       </w:r>
     </w:p>
     <w:p>
@@ -27253,7 +27493,7 @@
         <w:ind w:left="360"/>
       </w:pPr>
       <w:r>
-        <w:t>Le chef contrôle l'avancement des travaux</w:t>
+        <w:t>Le système affiche les détails (diagnostic, travaux prévus)</w:t>
       </w:r>
     </w:p>
     <w:p>
@@ -27264,7 +27504,7 @@
         <w:ind w:left="360"/>
       </w:pPr>
       <w:r>
-        <w:t>Le système affiche l'état de progression</w:t>
+        <w:t>Le chef ajuste le diagnostic suite à un problème découvert pendant les travaux</w:t>
       </w:r>
     </w:p>
     <w:p>
@@ -27275,7 +27515,7 @@
         <w:ind w:left="360"/>
       </w:pPr>
       <w:r>
-        <w:t>Le chef met à jour le statut de l'intervention</w:t>
+        <w:t>Le système confirme l'ajustement</w:t>
       </w:r>
     </w:p>
     <w:p>
@@ -27286,7 +27526,7 @@
         <w:ind w:left="360"/>
       </w:pPr>
       <w:r>
-        <w:t>Le système confirme la mise à jour</w:t>
+        <w:t>Le chef contrôle l'avancement des travaux</w:t>
       </w:r>
     </w:p>
     <w:p>
@@ -27297,7 +27537,7 @@
         <w:ind w:left="360"/>
       </w:pPr>
       <w:r>
-        <w:t>Le chef saisit les pièces consommées</w:t>
+        <w:t>Le système affiche l'état de progression</w:t>
       </w:r>
     </w:p>
     <w:p>
@@ -27308,7 +27548,39 @@
         <w:ind w:left="360"/>
       </w:pPr>
       <w:r>
-        <w:lastRenderedPageBreak/>
+        <w:t>Le chef met à jour le statut de l'intervention</w:t>
+      </w:r>
+    </w:p>
+    <w:p>
+      <w:pPr>
+        <w:tabs>
+          <w:tab w:val="left" w:pos="5560"/>
+        </w:tabs>
+        <w:ind w:left="360"/>
+      </w:pPr>
+      <w:r>
+        <w:t>Le système confirme la mise à jour</w:t>
+      </w:r>
+    </w:p>
+    <w:p>
+      <w:pPr>
+        <w:tabs>
+          <w:tab w:val="left" w:pos="5560"/>
+        </w:tabs>
+        <w:ind w:left="360"/>
+      </w:pPr>
+      <w:r>
+        <w:t>Le chef saisit les pièces consommées</w:t>
+      </w:r>
+    </w:p>
+    <w:p>
+      <w:pPr>
+        <w:tabs>
+          <w:tab w:val="left" w:pos="5560"/>
+        </w:tabs>
+        <w:ind w:left="360"/>
+      </w:pPr>
+      <w:r>
         <w:t>Le système met à jour le stock automatiquement</w:t>
       </w:r>
     </w:p>
@@ -27424,6 +27696,7 @@
           <w:szCs w:val="24"/>
           <w:lang w:eastAsia="fr-FR"/>
         </w:rPr>
+        <w:lastRenderedPageBreak/>
         <w:drawing>
           <wp:inline distT="0" distB="0" distL="0" distR="0">
             <wp:extent cx="5760720" cy="3996944"/>
@@ -27442,7 +27715,7 @@
                     </pic:cNvPicPr>
                   </pic:nvPicPr>
                   <pic:blipFill>
-                    <a:blip r:embed="rId15">
+                    <a:blip r:embed="rId17">
                       <a:extLst>
                         <a:ext uri="{28A0092B-C50C-407E-A947-70E740481C1C}">
                           <a14:useLocalDpi xmlns:a14="http://schemas.microsoft.com/office/drawing/2010/main" val="0"/>
@@ -27499,14 +27772,6 @@
           <w:szCs w:val="24"/>
         </w:rPr>
       </w:pPr>
-      <w:r>
-        <w:rPr>
-          <w:rFonts w:ascii="Times New Roman" w:hAnsi="Times New Roman" w:cs="Times New Roman"/>
-          <w:sz w:val="24"/>
-          <w:szCs w:val="24"/>
-        </w:rPr>
-        <w:t>Description :</w:t>
-      </w:r>
     </w:p>
     <w:p>
       <w:pPr>
@@ -27514,10 +27779,12 @@
           <w:tab w:val="left" w:pos="5560"/>
         </w:tabs>
         <w:ind w:left="360"/>
-      </w:pPr>
-      <w:r>
-        <w:t>Le directeur technique (ou chef de département) saisit ses identifiants</w:t>
-      </w:r>
+        <w:rPr>
+          <w:rFonts w:ascii="Times New Roman" w:hAnsi="Times New Roman" w:cs="Times New Roman"/>
+          <w:sz w:val="24"/>
+          <w:szCs w:val="24"/>
+        </w:rPr>
+      </w:pPr>
     </w:p>
     <w:p>
       <w:pPr>
@@ -27525,9 +27792,69 @@
           <w:tab w:val="left" w:pos="5560"/>
         </w:tabs>
         <w:ind w:left="360"/>
-      </w:pPr>
-      <w:r>
-        <w:t>Le système lui accorde l'accès</w:t>
+        <w:rPr>
+          <w:rFonts w:ascii="Times New Roman" w:hAnsi="Times New Roman" w:cs="Times New Roman"/>
+          <w:sz w:val="24"/>
+          <w:szCs w:val="24"/>
+        </w:rPr>
+      </w:pPr>
+      <w:r>
+        <w:rPr>
+          <w:rFonts w:ascii="Times New Roman" w:hAnsi="Times New Roman" w:cs="Times New Roman"/>
+          <w:noProof/>
+          <w:sz w:val="24"/>
+          <w:szCs w:val="24"/>
+          <w:lang w:eastAsia="fr-FR"/>
+        </w:rPr>
+        <w:lastRenderedPageBreak/>
+        <w:drawing>
+          <wp:inline distT="0" distB="0" distL="0" distR="0">
+            <wp:extent cx="5758512" cy="9376410"/>
+            <wp:effectExtent l="0" t="0" r="0" b="0"/>
+            <wp:docPr id="19" name="Image 19" descr="D:\l3\Memoire_De_Fin_Cycle\photo\dt.png"/>
+            <wp:cNvGraphicFramePr>
+              <a:graphicFrameLocks xmlns:a="http://schemas.openxmlformats.org/drawingml/2006/main" noChangeAspect="1"/>
+            </wp:cNvGraphicFramePr>
+            <a:graphic xmlns:a="http://schemas.openxmlformats.org/drawingml/2006/main">
+              <a:graphicData uri="http://schemas.openxmlformats.org/drawingml/2006/picture">
+                <pic:pic xmlns:pic="http://schemas.openxmlformats.org/drawingml/2006/picture">
+                  <pic:nvPicPr>
+                    <pic:cNvPr id="0" name="Picture 10" descr="D:\l3\Memoire_De_Fin_Cycle\photo\dt.png"/>
+                    <pic:cNvPicPr>
+                      <a:picLocks noChangeAspect="1" noChangeArrowheads="1"/>
+                    </pic:cNvPicPr>
+                  </pic:nvPicPr>
+                  <pic:blipFill>
+                    <a:blip r:embed="rId18">
+                      <a:extLst>
+                        <a:ext uri="{28A0092B-C50C-407E-A947-70E740481C1C}">
+                          <a14:useLocalDpi xmlns:a14="http://schemas.microsoft.com/office/drawing/2010/main" val="0"/>
+                        </a:ext>
+                      </a:extLst>
+                    </a:blip>
+                    <a:srcRect/>
+                    <a:stretch>
+                      <a:fillRect/>
+                    </a:stretch>
+                  </pic:blipFill>
+                  <pic:spPr bwMode="auto">
+                    <a:xfrm>
+                      <a:off x="0" y="0"/>
+                      <a:ext cx="5772235" cy="9398754"/>
+                    </a:xfrm>
+                    <a:prstGeom prst="rect">
+                      <a:avLst/>
+                    </a:prstGeom>
+                    <a:noFill/>
+                    <a:ln>
+                      <a:noFill/>
+                    </a:ln>
+                  </pic:spPr>
+                </pic:pic>
+              </a:graphicData>
+            </a:graphic>
+          </wp:inline>
+        </w:drawing>
       </w:r>
     </w:p>
     <w:p>
@@ -27536,10 +27863,12 @@
           <w:tab w:val="left" w:pos="5560"/>
         </w:tabs>
         <w:ind w:left="360"/>
-      </w:pPr>
-      <w:r>
-        <w:t>Il consulte la liste des interventions terminées</w:t>
-      </w:r>
+        <w:rPr>
+          <w:rFonts w:ascii="Times New Roman" w:hAnsi="Times New Roman" w:cs="Times New Roman"/>
+          <w:sz w:val="24"/>
+          <w:szCs w:val="24"/>
+        </w:rPr>
+      </w:pPr>
     </w:p>
     <w:p>
       <w:pPr>
@@ -27547,9 +27876,19 @@
           <w:tab w:val="left" w:pos="5560"/>
         </w:tabs>
         <w:ind w:left="360"/>
-      </w:pPr>
-      <w:r>
-        <w:t>Le système affiche la liste</w:t>
+        <w:rPr>
+          <w:rFonts w:ascii="Times New Roman" w:hAnsi="Times New Roman" w:cs="Times New Roman"/>
+          <w:sz w:val="24"/>
+          <w:szCs w:val="24"/>
+        </w:rPr>
+      </w:pPr>
+      <w:r>
+        <w:rPr>
+          <w:rFonts w:ascii="Times New Roman" w:hAnsi="Times New Roman" w:cs="Times New Roman"/>
+          <w:sz w:val="24"/>
+          <w:szCs w:val="24"/>
+        </w:rPr>
+        <w:t>Description :</w:t>
       </w:r>
     </w:p>
     <w:p>
@@ -27560,7 +27899,7 @@
         <w:ind w:left="360"/>
       </w:pPr>
       <w:r>
-        <w:t>Il sélectionne une intervention</w:t>
+        <w:t>Le directeur technique (ou chef de département) saisit ses identifiants</w:t>
       </w:r>
     </w:p>
     <w:p>
@@ -27571,7 +27910,7 @@
         <w:ind w:left="360"/>
       </w:pPr>
       <w:r>
-        <w:t>Le système affiche les détails des travaux réalisés</w:t>
+        <w:t>Le système lui accorde l'accès</w:t>
       </w:r>
     </w:p>
     <w:p>
@@ -27582,7 +27921,7 @@
         <w:ind w:left="360"/>
       </w:pPr>
       <w:r>
-        <w:t>Il démarre les essais du véhicule</w:t>
+        <w:t>Il consulte la liste des interventions terminées</w:t>
       </w:r>
     </w:p>
     <w:p>
@@ -27593,7 +27932,7 @@
         <w:ind w:left="360"/>
       </w:pPr>
       <w:r>
-        <w:t>Le système confirme le démarrage</w:t>
+        <w:t>Le système affiche la liste</w:t>
       </w:r>
     </w:p>
     <w:p>
@@ -27604,7 +27943,7 @@
         <w:ind w:left="360"/>
       </w:pPr>
       <w:r>
-        <w:t>Si le véhicule est conforme :</w:t>
+        <w:t>Il sélectionne une intervention</w:t>
       </w:r>
     </w:p>
     <w:p>
@@ -27615,8 +27954,7 @@
         <w:ind w:left="360"/>
       </w:pPr>
       <w:r>
-        <w:lastRenderedPageBreak/>
-        <w:t>Il valide les essais</w:t>
+        <w:t>Le système affiche les détails des travaux réalisés</w:t>
       </w:r>
     </w:p>
     <w:p>
@@ -27627,7 +27965,7 @@
         <w:ind w:left="360"/>
       </w:pPr>
       <w:r>
-        <w:t>Le système enregistre la validation</w:t>
+        <w:t>Il démarre les essais du véhicule</w:t>
       </w:r>
     </w:p>
     <w:p>
@@ -27638,7 +27976,7 @@
         <w:ind w:left="360"/>
       </w:pPr>
       <w:r>
-        <w:t>Il autorise la facturation</w:t>
+        <w:t>Le système confirme le démarrage</w:t>
       </w:r>
     </w:p>
     <w:p>
@@ -27649,7 +27987,7 @@
         <w:ind w:left="360"/>
       </w:pPr>
       <w:r>
-        <w:t>Le système notifie le réceptionniste</w:t>
+        <w:t>Si le véhicule est conforme :</w:t>
       </w:r>
     </w:p>
     <w:p>
@@ -27660,7 +27998,7 @@
         <w:ind w:left="360"/>
       </w:pPr>
       <w:r>
-        <w:t>Le système confirme la validation</w:t>
+        <w:t>Il valide les essais</w:t>
       </w:r>
     </w:p>
     <w:p>
@@ -27671,7 +28009,7 @@
         <w:ind w:left="360"/>
       </w:pPr>
       <w:r>
-        <w:t>Si le véhicule est non conforme :</w:t>
+        <w:t>Le système enregistre la validation</w:t>
       </w:r>
     </w:p>
     <w:p>
@@ -27682,7 +28020,7 @@
         <w:ind w:left="360"/>
       </w:pPr>
       <w:r>
-        <w:t>Il signale la non-conformité avec un motif</w:t>
+        <w:t>Il autorise la facturation</w:t>
       </w:r>
     </w:p>
     <w:p>
@@ -27693,7 +28031,7 @@
         <w:ind w:left="360"/>
       </w:pPr>
       <w:r>
-        <w:t>Le système enregistre la non-conformité</w:t>
+        <w:t>Le système notifie le réceptionniste</w:t>
       </w:r>
     </w:p>
     <w:p>
@@ -27704,7 +28042,7 @@
         <w:ind w:left="360"/>
       </w:pPr>
       <w:r>
-        <w:t>Il demande un retour en atelier</w:t>
+        <w:t>Le système confirme la validation</w:t>
       </w:r>
     </w:p>
     <w:p>
@@ -27715,7 +28053,7 @@
         <w:ind w:left="360"/>
       </w:pPr>
       <w:r>
-        <w:t>Le système notifie le chef de département</w:t>
+        <w:t>Si le véhicule est non conforme :</w:t>
       </w:r>
     </w:p>
     <w:p>
@@ -27726,7 +28064,7 @@
         <w:ind w:left="360"/>
       </w:pPr>
       <w:r>
-        <w:t>Le système notifie le réceptionniste</w:t>
+        <w:t>Il signale la non-conformité avec un motif</w:t>
       </w:r>
     </w:p>
     <w:p>
@@ -27737,7 +28075,7 @@
         <w:ind w:left="360"/>
       </w:pPr>
       <w:r>
-        <w:t>Le système confirme le signalement</w:t>
+        <w:t>Le système enregistre la non-conformité</w:t>
       </w:r>
     </w:p>
     <w:p>
@@ -27746,15 +28084,67 @@
           <w:tab w:val="left" w:pos="5560"/>
         </w:tabs>
         <w:ind w:left="360"/>
-        <w:rPr>
-          <w:rFonts w:ascii="Times New Roman" w:hAnsi="Times New Roman" w:cs="Times New Roman"/>
-          <w:sz w:val="24"/>
-          <w:szCs w:val="24"/>
-        </w:rPr>
+      </w:pPr>
+      <w:r>
+        <w:t>Il demande un retour en atelier</w:t>
+      </w:r>
+    </w:p>
+    <w:p>
+      <w:pPr>
+        <w:tabs>
+          <w:tab w:val="left" w:pos="5560"/>
+        </w:tabs>
+        <w:ind w:left="360"/>
+      </w:pPr>
+      <w:r>
+        <w:t>Le système notifie le chef de département</w:t>
+      </w:r>
+    </w:p>
+    <w:p>
+      <w:pPr>
+        <w:tabs>
+          <w:tab w:val="left" w:pos="5560"/>
+        </w:tabs>
+        <w:ind w:left="360"/>
+      </w:pPr>
+      <w:r>
+        <w:t>Le système notifie le réceptionniste</w:t>
+      </w:r>
+    </w:p>
+    <w:p>
+      <w:pPr>
+        <w:tabs>
+          <w:tab w:val="left" w:pos="5560"/>
+        </w:tabs>
+        <w:ind w:left="360"/>
+      </w:pPr>
+      <w:r>
+        <w:t>Le système confirme le signalement</w:t>
+      </w:r>
+    </w:p>
+    <w:p>
+      <w:pPr>
+        <w:tabs>
+          <w:tab w:val="left" w:pos="5560"/>
+        </w:tabs>
+        <w:ind w:left="360"/>
       </w:pPr>
       <w:r>
         <w:t>Le statut de l'intervention passe à "retour atelier"</w:t>
       </w:r>
+    </w:p>
+    <w:p>
+      <w:pPr>
+        <w:tabs>
+          <w:tab w:val="left" w:pos="5560"/>
+        </w:tabs>
+        <w:ind w:left="360"/>
+        <w:rPr>
+          <w:rFonts w:ascii="Times New Roman" w:hAnsi="Times New Roman" w:cs="Times New Roman"/>
+          <w:sz w:val="24"/>
+          <w:szCs w:val="24"/>
+        </w:rPr>
+      </w:pPr>
     </w:p>
     <w:p>
       <w:pPr>
@@ -27837,6 +28227,7 @@
           <w:szCs w:val="24"/>
           <w:lang w:eastAsia="fr-FR"/>
         </w:rPr>
+        <w:lastRenderedPageBreak/>
         <w:drawing>
           <wp:inline distT="0" distB="0" distL="0" distR="0">
             <wp:extent cx="5760720" cy="4381096"/>
@@ -27855,7 +28246,7 @@
                     </pic:cNvPicPr>
                   </pic:nvPicPr>
                   <pic:blipFill>
-                    <a:blip r:embed="rId16">
+                    <a:blip r:embed="rId19">
                       <a:extLst>
                         <a:ext uri="{28A0092B-C50C-407E-A947-70E740481C1C}">
                           <a14:useLocalDpi xmlns:a14="http://schemas.microsoft.com/office/drawing/2010/main" val="0"/>
@@ -27916,6 +28307,88 @@
         <w:tabs>
           <w:tab w:val="left" w:pos="5560"/>
         </w:tabs>
+        <w:rPr>
+          <w:rFonts w:ascii="Times New Roman" w:hAnsi="Times New Roman" w:cs="Times New Roman"/>
+          <w:sz w:val="24"/>
+          <w:szCs w:val="24"/>
+        </w:rPr>
+      </w:pPr>
+    </w:p>
+    <w:p>
+      <w:pPr>
+        <w:tabs>
+          <w:tab w:val="left" w:pos="5560"/>
+        </w:tabs>
+        <w:rPr>
+          <w:rFonts w:ascii="Times New Roman" w:hAnsi="Times New Roman" w:cs="Times New Roman"/>
+          <w:sz w:val="24"/>
+          <w:szCs w:val="24"/>
+        </w:rPr>
+      </w:pPr>
+      <w:r>
+        <w:rPr>
+          <w:rFonts w:ascii="Times New Roman" w:hAnsi="Times New Roman" w:cs="Times New Roman"/>
+          <w:noProof/>
+          <w:sz w:val="24"/>
+          <w:szCs w:val="24"/>
+          <w:lang w:eastAsia="fr-FR"/>
+        </w:rPr>
+        <w:lastRenderedPageBreak/>
+        <w:drawing>
+          <wp:inline distT="0" distB="0" distL="0" distR="0">
+            <wp:extent cx="6026150" cy="9613900"/>
+            <wp:effectExtent l="0" t="0" r="0" b="6350"/>
+            <wp:docPr id="12" name="Image 12" descr="D:\l3\Memoire_De_Fin_Cycle\photo\admin.png"/>
+            <wp:cNvGraphicFramePr>
+              <a:graphicFrameLocks xmlns:a="http://schemas.openxmlformats.org/drawingml/2006/main" noChangeAspect="1"/>
+            </wp:cNvGraphicFramePr>
+            <a:graphic xmlns:a="http://schemas.openxmlformats.org/drawingml/2006/main">
+              <a:graphicData uri="http://schemas.openxmlformats.org/drawingml/2006/picture">
+                <pic:pic xmlns:pic="http://schemas.openxmlformats.org/drawingml/2006/picture">
+                  <pic:nvPicPr>
+                    <pic:cNvPr id="0" name="Picture 4" descr="D:\l3\Memoire_De_Fin_Cycle\photo\admin.png"/>
+                    <pic:cNvPicPr>
+                      <a:picLocks noChangeAspect="1" noChangeArrowheads="1"/>
+                    </pic:cNvPicPr>
+                  </pic:nvPicPr>
+                  <pic:blipFill>
+                    <a:blip r:embed="rId20">
+                      <a:extLst>
+                        <a:ext uri="{28A0092B-C50C-407E-A947-70E740481C1C}">
+                          <a14:useLocalDpi xmlns:a14="http://schemas.microsoft.com/office/drawing/2010/main" val="0"/>
+                        </a:ext>
+                      </a:extLst>
+                    </a:blip>
+                    <a:srcRect/>
+                    <a:stretch>
+                      <a:fillRect/>
+                    </a:stretch>
+                  </pic:blipFill>
+                  <pic:spPr bwMode="auto">
+                    <a:xfrm>
+                      <a:off x="0" y="0"/>
+                      <a:ext cx="6026150" cy="9613900"/>
+                    </a:xfrm>
+                    <a:prstGeom prst="rect">
+                      <a:avLst/>
+                    </a:prstGeom>
+                    <a:noFill/>
+                    <a:ln>
+                      <a:noFill/>
+                    </a:ln>
+                  </pic:spPr>
+                </pic:pic>
+              </a:graphicData>
+            </a:graphic>
+          </wp:inline>
+        </w:drawing>
+      </w:r>
+    </w:p>
+    <w:p>
+      <w:pPr>
+        <w:tabs>
+          <w:tab w:val="left" w:pos="5560"/>
+        </w:tabs>
         <w:ind w:left="360"/>
         <w:rPr>
           <w:rFonts w:ascii="Times New Roman" w:hAnsi="Times New Roman" w:cs="Times New Roman"/>
@@ -27926,19 +28399,101 @@
       <w:r>
         <w:rPr>
           <w:rFonts w:ascii="Times New Roman" w:hAnsi="Times New Roman" w:cs="Times New Roman"/>
-          <w:sz w:val="24"/>
-          <w:szCs w:val="24"/>
-        </w:rPr>
-        <w:t xml:space="preserve">III.  </w:t>
-      </w:r>
-      <w:r>
-        <w:rPr>
-          <w:rFonts w:ascii="Times New Roman" w:hAnsi="Times New Roman" w:cs="Times New Roman"/>
-          <w:sz w:val="24"/>
-          <w:szCs w:val="24"/>
-        </w:rPr>
+          <w:noProof/>
+          <w:sz w:val="24"/>
+          <w:szCs w:val="24"/>
+          <w:lang w:eastAsia="fr-FR"/>
+        </w:rPr>
+        <w:lastRenderedPageBreak/>
+        <w:drawing>
+          <wp:inline distT="0" distB="0" distL="0" distR="0">
+            <wp:extent cx="5295900" cy="8947150"/>
+            <wp:effectExtent l="0" t="0" r="0" b="6350"/>
+            <wp:docPr id="13" name="Image 13" descr="D:\l3\Memoire_De_Fin_Cycle\photo\admin1.png"/>
+            <wp:cNvGraphicFramePr>
+              <a:graphicFrameLocks xmlns:a="http://schemas.openxmlformats.org/drawingml/2006/main" noChangeAspect="1"/>
+            </wp:cNvGraphicFramePr>
+            <a:graphic xmlns:a="http://schemas.openxmlformats.org/drawingml/2006/main">
+              <a:graphicData uri="http://schemas.openxmlformats.org/drawingml/2006/picture">
+                <pic:pic xmlns:pic="http://schemas.openxmlformats.org/drawingml/2006/picture">
+                  <pic:nvPicPr>
+                    <pic:cNvPr id="0" name="Picture 5" descr="D:\l3\Memoire_De_Fin_Cycle\photo\admin1.png"/>
+                    <pic:cNvPicPr>
+                      <a:picLocks noChangeAspect="1" noChangeArrowheads="1"/>
+                    </pic:cNvPicPr>
+                  </pic:nvPicPr>
+                  <pic:blipFill>
+                    <a:blip r:embed="rId21">
+                      <a:extLst>
+                        <a:ext uri="{28A0092B-C50C-407E-A947-70E740481C1C}">
+                          <a14:useLocalDpi xmlns:a14="http://schemas.microsoft.com/office/drawing/2010/main" val="0"/>
+                        </a:ext>
+                      </a:extLst>
+                    </a:blip>
+                    <a:srcRect/>
+                    <a:stretch>
+                      <a:fillRect/>
+                    </a:stretch>
+                  </pic:blipFill>
+                  <pic:spPr bwMode="auto">
+                    <a:xfrm>
+                      <a:off x="0" y="0"/>
+                      <a:ext cx="5295900" cy="8947150"/>
+                    </a:xfrm>
+                    <a:prstGeom prst="rect">
+                      <a:avLst/>
+                    </a:prstGeom>
+                    <a:noFill/>
+                    <a:ln>
+                      <a:noFill/>
+                    </a:ln>
+                  </pic:spPr>
+                </pic:pic>
+              </a:graphicData>
+            </a:graphic>
+          </wp:inline>
+        </w:drawing>
+      </w:r>
+    </w:p>
+    <w:p>
+      <w:pPr>
+        <w:pStyle w:val="Paragraphedeliste"/>
+        <w:numPr>
+          <w:ilvl w:val="0"/>
+          <w:numId w:val="29"/>
+        </w:numPr>
+        <w:tabs>
+          <w:tab w:val="left" w:pos="5560"/>
+        </w:tabs>
+        <w:rPr>
+          <w:rFonts w:ascii="Times New Roman" w:hAnsi="Times New Roman" w:cs="Times New Roman"/>
+          <w:sz w:val="24"/>
+          <w:szCs w:val="24"/>
+        </w:rPr>
+      </w:pPr>
+      <w:r>
+        <w:rPr>
+          <w:rFonts w:ascii="Times New Roman" w:hAnsi="Times New Roman" w:cs="Times New Roman"/>
+          <w:sz w:val="24"/>
+          <w:szCs w:val="24"/>
+        </w:rPr>
+        <w:lastRenderedPageBreak/>
         <w:t>Diagramme de séquence</w:t>
       </w:r>
+    </w:p>
+    <w:p>
+      <w:pPr>
+        <w:pStyle w:val="Paragraphedeliste"/>
+        <w:tabs>
+          <w:tab w:val="left" w:pos="5560"/>
+        </w:tabs>
+        <w:ind w:left="1080"/>
+        <w:rPr>
+          <w:rFonts w:ascii="Times New Roman" w:hAnsi="Times New Roman" w:cs="Times New Roman"/>
+          <w:sz w:val="24"/>
+          <w:szCs w:val="24"/>
+        </w:rPr>
+      </w:pPr>
     </w:p>
     <w:p>
       <w:pPr>
@@ -28035,7 +28590,7 @@
         <v:path o:extrusionok="f" gradientshapeok="t" o:connecttype="rect"/>
         <o:lock v:ext="edit" aspectratio="t"/>
       </v:shapetype>
-      <v:shape id="_x0000_i1029" type="#_x0000_t75" style="width:11.25pt;height:11.25pt" o:bullet="t">
+      <v:shape id="_x0000_i1038" type="#_x0000_t75" style="width:11.5pt;height:11.5pt" o:bullet="t">
         <v:imagedata r:id="rId1" o:title="mso3B8"/>
       </v:shape>
     </w:pict>
@@ -32660,7 +33215,7 @@
 </file>
 
 <file path=customXml/itemProps1.xml><?xml version="1.0" encoding="utf-8"?>
-<ds:datastoreItem xmlns:ds="http://schemas.openxmlformats.org/officeDocument/2006/customXml" ds:itemID="{224C4221-C2E9-454F-B878-E38882292BBD}">
+<ds:datastoreItem xmlns:ds="http://schemas.openxmlformats.org/officeDocument/2006/customXml" ds:itemID="{95A71247-AAE0-4A17-AF37-27E6676B7B19}">
   <ds:schemaRefs>
     <ds:schemaRef ds:uri="http://schemas.openxmlformats.org/officeDocument/2006/bibliography"/>
   </ds:schemaRefs>

</xml_diff>

<commit_message>
ajout diagramme de classe
</commit_message>
<xml_diff>
--- a/projet_memoire.docx
+++ b/projet_memoire.docx
@@ -25474,30 +25474,6 @@
           <w:szCs w:val="24"/>
         </w:rPr>
       </w:pPr>
-      <w:r>
-        <w:rPr>
-          <w:rFonts w:ascii="Times New Roman" w:hAnsi="Times New Roman" w:cs="Times New Roman"/>
-          <w:sz w:val="24"/>
-          <w:szCs w:val="24"/>
-        </w:rPr>
-        <w:t xml:space="preserve">Diagramme de </w:t>
-      </w:r>
-      <w:r>
-        <w:rPr>
-          <w:rFonts w:ascii="Times New Roman" w:hAnsi="Times New Roman" w:cs="Times New Roman"/>
-          <w:sz w:val="24"/>
-          <w:szCs w:val="24"/>
-        </w:rPr>
-        <w:t xml:space="preserve">Séquence de Gérer </w:t>
-      </w:r>
-      <w:r>
-        <w:rPr>
-          <w:rFonts w:ascii="Times New Roman" w:hAnsi="Times New Roman" w:cs="Times New Roman"/>
-          <w:sz w:val="24"/>
-          <w:szCs w:val="24"/>
-        </w:rPr>
-        <w:t xml:space="preserve">rendez-vous </w:t>
-      </w:r>
     </w:p>
     <w:p>
       <w:pPr>
@@ -25511,6 +25487,119 @@
           <w:szCs w:val="24"/>
         </w:rPr>
       </w:pPr>
+    </w:p>
+    <w:p>
+      <w:pPr>
+        <w:tabs>
+          <w:tab w:val="left" w:pos="5560"/>
+        </w:tabs>
+        <w:ind w:left="360"/>
+        <w:rPr>
+          <w:rFonts w:ascii="Times New Roman" w:hAnsi="Times New Roman" w:cs="Times New Roman"/>
+          <w:sz w:val="24"/>
+          <w:szCs w:val="24"/>
+        </w:rPr>
+      </w:pPr>
+    </w:p>
+    <w:p>
+      <w:pPr>
+        <w:tabs>
+          <w:tab w:val="left" w:pos="5560"/>
+        </w:tabs>
+        <w:ind w:left="360"/>
+        <w:rPr>
+          <w:rFonts w:ascii="Times New Roman" w:hAnsi="Times New Roman" w:cs="Times New Roman"/>
+          <w:sz w:val="24"/>
+          <w:szCs w:val="24"/>
+        </w:rPr>
+      </w:pPr>
+    </w:p>
+    <w:p>
+      <w:pPr>
+        <w:tabs>
+          <w:tab w:val="left" w:pos="5560"/>
+        </w:tabs>
+        <w:ind w:left="360"/>
+        <w:rPr>
+          <w:rFonts w:ascii="Times New Roman" w:hAnsi="Times New Roman" w:cs="Times New Roman"/>
+          <w:sz w:val="24"/>
+          <w:szCs w:val="24"/>
+        </w:rPr>
+      </w:pPr>
+    </w:p>
+    <w:p>
+      <w:pPr>
+        <w:tabs>
+          <w:tab w:val="left" w:pos="5560"/>
+        </w:tabs>
+        <w:ind w:left="360"/>
+        <w:rPr>
+          <w:rFonts w:ascii="Times New Roman" w:hAnsi="Times New Roman" w:cs="Times New Roman"/>
+          <w:sz w:val="24"/>
+          <w:szCs w:val="24"/>
+        </w:rPr>
+      </w:pPr>
+    </w:p>
+    <w:p>
+      <w:pPr>
+        <w:tabs>
+          <w:tab w:val="left" w:pos="5560"/>
+        </w:tabs>
+        <w:ind w:left="360"/>
+        <w:rPr>
+          <w:rFonts w:ascii="Times New Roman" w:hAnsi="Times New Roman" w:cs="Times New Roman"/>
+          <w:sz w:val="24"/>
+          <w:szCs w:val="24"/>
+        </w:rPr>
+      </w:pPr>
+    </w:p>
+    <w:p>
+      <w:pPr>
+        <w:tabs>
+          <w:tab w:val="left" w:pos="5560"/>
+        </w:tabs>
+        <w:ind w:left="360"/>
+        <w:rPr>
+          <w:rFonts w:ascii="Times New Roman" w:hAnsi="Times New Roman" w:cs="Times New Roman"/>
+          <w:sz w:val="24"/>
+          <w:szCs w:val="24"/>
+        </w:rPr>
+      </w:pPr>
+    </w:p>
+    <w:p>
+      <w:pPr>
+        <w:tabs>
+          <w:tab w:val="left" w:pos="5560"/>
+        </w:tabs>
+        <w:ind w:left="360"/>
+        <w:rPr>
+          <w:rFonts w:ascii="Times New Roman" w:hAnsi="Times New Roman" w:cs="Times New Roman"/>
+          <w:sz w:val="24"/>
+          <w:szCs w:val="24"/>
+        </w:rPr>
+      </w:pPr>
+      <w:r>
+        <w:rPr>
+          <w:rFonts w:ascii="Times New Roman" w:hAnsi="Times New Roman" w:cs="Times New Roman"/>
+          <w:sz w:val="24"/>
+          <w:szCs w:val="24"/>
+        </w:rPr>
+        <w:lastRenderedPageBreak/>
+        <w:t>Diagramme de Séquence de s’Authentifier</w:t>
+      </w:r>
+    </w:p>
+    <w:p>
+      <w:pPr>
+        <w:tabs>
+          <w:tab w:val="left" w:pos="5560"/>
+        </w:tabs>
+        <w:ind w:left="360"/>
+        <w:rPr>
+          <w:rFonts w:ascii="Times New Roman" w:hAnsi="Times New Roman" w:cs="Times New Roman"/>
+          <w:sz w:val="24"/>
+          <w:szCs w:val="24"/>
+        </w:rPr>
+      </w:pPr>
       <w:r>
         <w:rPr>
           <w:rFonts w:ascii="Times New Roman" w:hAnsi="Times New Roman" w:cs="Times New Roman"/>
@@ -25519,12 +25608,11 @@
           <w:szCs w:val="24"/>
           <w:lang w:eastAsia="fr-FR"/>
         </w:rPr>
-        <w:lastRenderedPageBreak/>
         <w:drawing>
           <wp:inline distT="0" distB="0" distL="0" distR="0">
-            <wp:extent cx="5289550" cy="9429750"/>
-            <wp:effectExtent l="0" t="0" r="6350" b="0"/>
-            <wp:docPr id="17" name="Image 17" descr="D:\l3\Memoire_De_Fin_Cycle\photo\cli.png"/>
+            <wp:extent cx="4774557" cy="5793105"/>
+            <wp:effectExtent l="0" t="0" r="7620" b="0"/>
+            <wp:docPr id="6" name="Image 6" descr="D:\l3\Memoire_De_Fin_Cycle\photo\authentifier.png"/>
             <wp:cNvGraphicFramePr>
               <a:graphicFrameLocks xmlns:a="http://schemas.openxmlformats.org/drawingml/2006/main" noChangeAspect="1"/>
             </wp:cNvGraphicFramePr>
@@ -25532,7 +25620,7 @@
               <a:graphicData uri="http://schemas.openxmlformats.org/drawingml/2006/picture">
                 <pic:pic xmlns:pic="http://schemas.openxmlformats.org/drawingml/2006/picture">
                   <pic:nvPicPr>
-                    <pic:cNvPr id="0" name="Picture 9" descr="D:\l3\Memoire_De_Fin_Cycle\photo\cli.png"/>
+                    <pic:cNvPr id="0" name="Picture 3" descr="D:\l3\Memoire_De_Fin_Cycle\photo\authentifier.png"/>
                     <pic:cNvPicPr>
                       <a:picLocks noChangeAspect="1" noChangeArrowheads="1"/>
                     </pic:cNvPicPr>
@@ -25553,7 +25641,7 @@
                   <pic:spPr bwMode="auto">
                     <a:xfrm>
                       <a:off x="0" y="0"/>
-                      <a:ext cx="5289550" cy="9429750"/>
+                      <a:ext cx="4778115" cy="5797423"/>
                     </a:xfrm>
                     <a:prstGeom prst="rect">
                       <a:avLst/>
@@ -25569,6 +25657,14 @@
           </wp:inline>
         </w:drawing>
       </w:r>
+      <w:r>
+        <w:rPr>
+          <w:rFonts w:ascii="Times New Roman" w:hAnsi="Times New Roman" w:cs="Times New Roman"/>
+          <w:sz w:val="24"/>
+          <w:szCs w:val="24"/>
+        </w:rPr>
+        <w:t xml:space="preserve"> </w:t>
+      </w:r>
     </w:p>
     <w:p>
       <w:pPr>
@@ -25582,15 +25678,6 @@
           <w:szCs w:val="24"/>
         </w:rPr>
       </w:pPr>
-      <w:r>
-        <w:rPr>
-          <w:rFonts w:ascii="Times New Roman" w:hAnsi="Times New Roman" w:cs="Times New Roman"/>
-          <w:sz w:val="24"/>
-          <w:szCs w:val="24"/>
-        </w:rPr>
-        <w:lastRenderedPageBreak/>
-        <w:t>Description</w:t>
-      </w:r>
     </w:p>
     <w:p>
       <w:pPr>
@@ -25604,14 +25691,6 @@
           <w:szCs w:val="24"/>
         </w:rPr>
       </w:pPr>
-      <w:r>
-        <w:rPr>
-          <w:rFonts w:ascii="Times New Roman" w:hAnsi="Times New Roman" w:cs="Times New Roman"/>
-          <w:sz w:val="24"/>
-          <w:szCs w:val="24"/>
-        </w:rPr>
-        <w:t>Premier Partie : Identification</w:t>
-      </w:r>
     </w:p>
     <w:p>
       <w:pPr>
@@ -25625,22 +25704,6 @@
           <w:szCs w:val="24"/>
         </w:rPr>
       </w:pPr>
-      <w:r>
-        <w:rPr>
-          <w:rFonts w:ascii="Times New Roman" w:hAnsi="Times New Roman" w:cs="Times New Roman"/>
-          <w:sz w:val="24"/>
-          <w:szCs w:val="24"/>
-        </w:rPr>
-        <w:t xml:space="preserve">Nom : </w:t>
-      </w:r>
-      <w:r>
-        <w:rPr>
-          <w:rFonts w:ascii="Times New Roman" w:hAnsi="Times New Roman" w:cs="Times New Roman"/>
-          <w:sz w:val="24"/>
-          <w:szCs w:val="24"/>
-        </w:rPr>
-        <w:t xml:space="preserve">Prise de rendez-vous </w:t>
-      </w:r>
     </w:p>
     <w:p>
       <w:pPr>
@@ -25654,14 +25717,6 @@
           <w:szCs w:val="24"/>
         </w:rPr>
       </w:pPr>
-      <w:r>
-        <w:rPr>
-          <w:rFonts w:ascii="Times New Roman" w:hAnsi="Times New Roman" w:cs="Times New Roman"/>
-          <w:sz w:val="24"/>
-          <w:szCs w:val="24"/>
-        </w:rPr>
-        <w:t>Acteur : Client</w:t>
-      </w:r>
     </w:p>
     <w:p>
       <w:pPr>
@@ -25675,22 +25730,6 @@
           <w:szCs w:val="24"/>
         </w:rPr>
       </w:pPr>
-      <w:r>
-        <w:rPr>
-          <w:rFonts w:ascii="Times New Roman" w:hAnsi="Times New Roman" w:cs="Times New Roman"/>
-          <w:sz w:val="24"/>
-          <w:szCs w:val="24"/>
-        </w:rPr>
-        <w:t xml:space="preserve">Objectif : </w:t>
-      </w:r>
-      <w:r>
-        <w:rPr>
-          <w:rFonts w:ascii="Times New Roman" w:hAnsi="Times New Roman" w:cs="Times New Roman"/>
-          <w:sz w:val="24"/>
-          <w:szCs w:val="24"/>
-        </w:rPr>
-        <w:t>permet au client de l’entreprise de créer un compte et de planifier ses rendez-vous s’il y’a des créneaux disponibles.</w:t>
-      </w:r>
     </w:p>
     <w:p>
       <w:pPr>
@@ -25704,14 +25743,6 @@
           <w:szCs w:val="24"/>
         </w:rPr>
       </w:pPr>
-      <w:r>
-        <w:rPr>
-          <w:rFonts w:ascii="Times New Roman" w:hAnsi="Times New Roman" w:cs="Times New Roman"/>
-          <w:sz w:val="24"/>
-          <w:szCs w:val="24"/>
-        </w:rPr>
-        <w:t xml:space="preserve">Acteur : Client garage automobile </w:t>
-      </w:r>
     </w:p>
     <w:p>
       <w:pPr>
@@ -25725,14 +25756,6 @@
           <w:szCs w:val="24"/>
         </w:rPr>
       </w:pPr>
-      <w:r>
-        <w:rPr>
-          <w:rFonts w:ascii="Times New Roman" w:hAnsi="Times New Roman" w:cs="Times New Roman"/>
-          <w:sz w:val="24"/>
-          <w:szCs w:val="24"/>
-        </w:rPr>
-        <w:t>Deuxième partie : Description Scenario</w:t>
-      </w:r>
     </w:p>
     <w:p>
       <w:pPr>
@@ -25746,21 +25769,41 @@
           <w:szCs w:val="24"/>
         </w:rPr>
       </w:pPr>
-      <w:r>
-        <w:rPr>
-          <w:rFonts w:ascii="Times New Roman" w:hAnsi="Times New Roman" w:cs="Times New Roman"/>
-          <w:sz w:val="24"/>
-          <w:szCs w:val="24"/>
-        </w:rPr>
-        <w:t>Précondition : l’appli</w:t>
-      </w:r>
-      <w:r>
-        <w:rPr>
-          <w:rFonts w:ascii="Times New Roman" w:hAnsi="Times New Roman" w:cs="Times New Roman"/>
-          <w:sz w:val="24"/>
-          <w:szCs w:val="24"/>
-        </w:rPr>
-        <w:t xml:space="preserve">cation doit être opérationnelle, le système doit transmettre à l’interface nécessaires pour afficher les créneaux disponibles. </w:t>
+    </w:p>
+    <w:p>
+      <w:pPr>
+        <w:tabs>
+          <w:tab w:val="left" w:pos="5560"/>
+        </w:tabs>
+        <w:rPr>
+          <w:rFonts w:ascii="Times New Roman" w:hAnsi="Times New Roman" w:cs="Times New Roman"/>
+          <w:sz w:val="24"/>
+          <w:szCs w:val="24"/>
+        </w:rPr>
+      </w:pPr>
+      <w:r>
+        <w:rPr>
+          <w:rFonts w:ascii="Times New Roman" w:hAnsi="Times New Roman" w:cs="Times New Roman"/>
+          <w:sz w:val="24"/>
+          <w:szCs w:val="24"/>
+        </w:rPr>
+        <w:t xml:space="preserve">Diagramme de </w:t>
+      </w:r>
+      <w:r>
+        <w:rPr>
+          <w:rFonts w:ascii="Times New Roman" w:hAnsi="Times New Roman" w:cs="Times New Roman"/>
+          <w:sz w:val="24"/>
+          <w:szCs w:val="24"/>
+        </w:rPr>
+        <w:t xml:space="preserve">Séquence de Gérer </w:t>
+      </w:r>
+      <w:r>
+        <w:rPr>
+          <w:rFonts w:ascii="Times New Roman" w:hAnsi="Times New Roman" w:cs="Times New Roman"/>
+          <w:sz w:val="24"/>
+          <w:szCs w:val="24"/>
+        </w:rPr>
+        <w:t xml:space="preserve">rendez-vous </w:t>
       </w:r>
     </w:p>
     <w:p>
@@ -25775,14 +25818,6 @@
           <w:szCs w:val="24"/>
         </w:rPr>
       </w:pPr>
-      <w:r>
-        <w:rPr>
-          <w:rFonts w:ascii="Times New Roman" w:hAnsi="Times New Roman" w:cs="Times New Roman"/>
-          <w:sz w:val="24"/>
-          <w:szCs w:val="24"/>
-        </w:rPr>
-        <w:t>L’enchainement des messages :</w:t>
-      </w:r>
     </w:p>
     <w:p>
       <w:pPr>
@@ -25802,7 +25837,7 @@
           <w:sz w:val="24"/>
           <w:szCs w:val="24"/>
         </w:rPr>
-        <w:t>Le client ouvre l'application</w:t>
+        <w:t>Description</w:t>
       </w:r>
     </w:p>
     <w:p>
@@ -25823,7 +25858,7 @@
           <w:sz w:val="24"/>
           <w:szCs w:val="24"/>
         </w:rPr>
-        <w:t>Le système affiche automatiquement les créneaux disponibles</w:t>
+        <w:t>Premier Partie : Identification</w:t>
       </w:r>
     </w:p>
     <w:p>
@@ -25844,7 +25879,15 @@
           <w:sz w:val="24"/>
           <w:szCs w:val="24"/>
         </w:rPr>
-        <w:t>Le client sélectionne une date et une heure</w:t>
+        <w:t xml:space="preserve">Nom : </w:t>
+      </w:r>
+      <w:r>
+        <w:rPr>
+          <w:rFonts w:ascii="Times New Roman" w:hAnsi="Times New Roman" w:cs="Times New Roman"/>
+          <w:sz w:val="24"/>
+          <w:szCs w:val="24"/>
+        </w:rPr>
+        <w:t xml:space="preserve">Prise de rendez-vous </w:t>
       </w:r>
     </w:p>
     <w:p>
@@ -25865,7 +25908,7 @@
           <w:sz w:val="24"/>
           <w:szCs w:val="24"/>
         </w:rPr>
-        <w:t>Le système lui demande de se connecter avant de continuer</w:t>
+        <w:t>Acteur : Client</w:t>
       </w:r>
     </w:p>
     <w:p>
@@ -25886,7 +25929,15 @@
           <w:sz w:val="24"/>
           <w:szCs w:val="24"/>
         </w:rPr>
-        <w:t>Si le client a déjà un compte :</w:t>
+        <w:t xml:space="preserve">Objectif : </w:t>
+      </w:r>
+      <w:r>
+        <w:rPr>
+          <w:rFonts w:ascii="Times New Roman" w:hAnsi="Times New Roman" w:cs="Times New Roman"/>
+          <w:sz w:val="24"/>
+          <w:szCs w:val="24"/>
+        </w:rPr>
+        <w:t>permet au client de l’entreprise de créer un compte et de planifier ses rendez-vous s’il y’a des créneaux disponibles.</w:t>
       </w:r>
     </w:p>
     <w:p>
@@ -25907,7 +25958,7 @@
           <w:sz w:val="24"/>
           <w:szCs w:val="24"/>
         </w:rPr>
-        <w:t>Il saisit son identifiant et son mot de passe</w:t>
+        <w:t xml:space="preserve">Acteur : Client garage automobile </w:t>
       </w:r>
     </w:p>
     <w:p>
@@ -25928,7 +25979,7 @@
           <w:sz w:val="24"/>
           <w:szCs w:val="24"/>
         </w:rPr>
-        <w:t>Le système lui accorde l'accès</w:t>
+        <w:t>Deuxième partie : Description Scenario</w:t>
       </w:r>
     </w:p>
     <w:p>
@@ -25949,7 +26000,15 @@
           <w:sz w:val="24"/>
           <w:szCs w:val="24"/>
         </w:rPr>
-        <w:t>Si le client n'a pas de compte :</w:t>
+        <w:t>Précondition : l’appli</w:t>
+      </w:r>
+      <w:r>
+        <w:rPr>
+          <w:rFonts w:ascii="Times New Roman" w:hAnsi="Times New Roman" w:cs="Times New Roman"/>
+          <w:sz w:val="24"/>
+          <w:szCs w:val="24"/>
+        </w:rPr>
+        <w:t xml:space="preserve">cation doit être opérationnelle, le système doit transmettre à l’interface nécessaires pour afficher les créneaux disponibles. </w:t>
       </w:r>
     </w:p>
     <w:p>
@@ -25970,7 +26029,7 @@
           <w:sz w:val="24"/>
           <w:szCs w:val="24"/>
         </w:rPr>
-        <w:t>Il crée un nouveau compte avec ses informations</w:t>
+        <w:t>L’enchainement des messages :</w:t>
       </w:r>
     </w:p>
     <w:p>
@@ -25991,7 +26050,7 @@
           <w:sz w:val="24"/>
           <w:szCs w:val="24"/>
         </w:rPr>
-        <w:t>Le système confirme la création du compte</w:t>
+        <w:t>Le client ouvre l'application</w:t>
       </w:r>
     </w:p>
     <w:p>
@@ -26012,7 +26071,7 @@
           <w:sz w:val="24"/>
           <w:szCs w:val="24"/>
         </w:rPr>
-        <w:t>Le client se connecte avec ses nouveaux identifiants</w:t>
+        <w:t>Le système affiche automatiquement les créneaux disponibles</w:t>
       </w:r>
     </w:p>
     <w:p>
@@ -26033,7 +26092,7 @@
           <w:sz w:val="24"/>
           <w:szCs w:val="24"/>
         </w:rPr>
-        <w:t>Le système lui accorde l'accès</w:t>
+        <w:t>Le client sélectionne une date et une heure</w:t>
       </w:r>
     </w:p>
     <w:p>
@@ -26054,6 +26113,195 @@
           <w:sz w:val="24"/>
           <w:szCs w:val="24"/>
         </w:rPr>
+        <w:t>Le système lui demande de se connecter avant de continuer</w:t>
+      </w:r>
+    </w:p>
+    <w:p>
+      <w:pPr>
+        <w:tabs>
+          <w:tab w:val="left" w:pos="5560"/>
+        </w:tabs>
+        <w:ind w:left="360"/>
+        <w:rPr>
+          <w:rFonts w:ascii="Times New Roman" w:hAnsi="Times New Roman" w:cs="Times New Roman"/>
+          <w:sz w:val="24"/>
+          <w:szCs w:val="24"/>
+        </w:rPr>
+      </w:pPr>
+      <w:r>
+        <w:rPr>
+          <w:rFonts w:ascii="Times New Roman" w:hAnsi="Times New Roman" w:cs="Times New Roman"/>
+          <w:sz w:val="24"/>
+          <w:szCs w:val="24"/>
+        </w:rPr>
+        <w:t>Si le client a déjà un compte :</w:t>
+      </w:r>
+    </w:p>
+    <w:p>
+      <w:pPr>
+        <w:tabs>
+          <w:tab w:val="left" w:pos="5560"/>
+        </w:tabs>
+        <w:ind w:left="360"/>
+        <w:rPr>
+          <w:rFonts w:ascii="Times New Roman" w:hAnsi="Times New Roman" w:cs="Times New Roman"/>
+          <w:sz w:val="24"/>
+          <w:szCs w:val="24"/>
+        </w:rPr>
+      </w:pPr>
+      <w:r>
+        <w:rPr>
+          <w:rFonts w:ascii="Times New Roman" w:hAnsi="Times New Roman" w:cs="Times New Roman"/>
+          <w:sz w:val="24"/>
+          <w:szCs w:val="24"/>
+        </w:rPr>
+        <w:t>Il saisit son identifiant et son mot de passe</w:t>
+      </w:r>
+    </w:p>
+    <w:p>
+      <w:pPr>
+        <w:tabs>
+          <w:tab w:val="left" w:pos="5560"/>
+        </w:tabs>
+        <w:ind w:left="360"/>
+        <w:rPr>
+          <w:rFonts w:ascii="Times New Roman" w:hAnsi="Times New Roman" w:cs="Times New Roman"/>
+          <w:sz w:val="24"/>
+          <w:szCs w:val="24"/>
+        </w:rPr>
+      </w:pPr>
+      <w:r>
+        <w:rPr>
+          <w:rFonts w:ascii="Times New Roman" w:hAnsi="Times New Roman" w:cs="Times New Roman"/>
+          <w:sz w:val="24"/>
+          <w:szCs w:val="24"/>
+        </w:rPr>
+        <w:t>Le système lui accorde l'accès</w:t>
+      </w:r>
+    </w:p>
+    <w:p>
+      <w:pPr>
+        <w:tabs>
+          <w:tab w:val="left" w:pos="5560"/>
+        </w:tabs>
+        <w:ind w:left="360"/>
+        <w:rPr>
+          <w:rFonts w:ascii="Times New Roman" w:hAnsi="Times New Roman" w:cs="Times New Roman"/>
+          <w:sz w:val="24"/>
+          <w:szCs w:val="24"/>
+        </w:rPr>
+      </w:pPr>
+      <w:r>
+        <w:rPr>
+          <w:rFonts w:ascii="Times New Roman" w:hAnsi="Times New Roman" w:cs="Times New Roman"/>
+          <w:sz w:val="24"/>
+          <w:szCs w:val="24"/>
+        </w:rPr>
+        <w:t>Si le client n'a pas de compte :</w:t>
+      </w:r>
+    </w:p>
+    <w:p>
+      <w:pPr>
+        <w:tabs>
+          <w:tab w:val="left" w:pos="5560"/>
+        </w:tabs>
+        <w:ind w:left="360"/>
+        <w:rPr>
+          <w:rFonts w:ascii="Times New Roman" w:hAnsi="Times New Roman" w:cs="Times New Roman"/>
+          <w:sz w:val="24"/>
+          <w:szCs w:val="24"/>
+        </w:rPr>
+      </w:pPr>
+      <w:r>
+        <w:rPr>
+          <w:rFonts w:ascii="Times New Roman" w:hAnsi="Times New Roman" w:cs="Times New Roman"/>
+          <w:sz w:val="24"/>
+          <w:szCs w:val="24"/>
+        </w:rPr>
+        <w:t>Il crée un nouveau compte avec ses informations</w:t>
+      </w:r>
+    </w:p>
+    <w:p>
+      <w:pPr>
+        <w:tabs>
+          <w:tab w:val="left" w:pos="5560"/>
+        </w:tabs>
+        <w:ind w:left="360"/>
+        <w:rPr>
+          <w:rFonts w:ascii="Times New Roman" w:hAnsi="Times New Roman" w:cs="Times New Roman"/>
+          <w:sz w:val="24"/>
+          <w:szCs w:val="24"/>
+        </w:rPr>
+      </w:pPr>
+      <w:r>
+        <w:rPr>
+          <w:rFonts w:ascii="Times New Roman" w:hAnsi="Times New Roman" w:cs="Times New Roman"/>
+          <w:sz w:val="24"/>
+          <w:szCs w:val="24"/>
+        </w:rPr>
+        <w:t>Le système confirme la création du compte</w:t>
+      </w:r>
+    </w:p>
+    <w:p>
+      <w:pPr>
+        <w:tabs>
+          <w:tab w:val="left" w:pos="5560"/>
+        </w:tabs>
+        <w:ind w:left="360"/>
+        <w:rPr>
+          <w:rFonts w:ascii="Times New Roman" w:hAnsi="Times New Roman" w:cs="Times New Roman"/>
+          <w:sz w:val="24"/>
+          <w:szCs w:val="24"/>
+        </w:rPr>
+      </w:pPr>
+      <w:r>
+        <w:rPr>
+          <w:rFonts w:ascii="Times New Roman" w:hAnsi="Times New Roman" w:cs="Times New Roman"/>
+          <w:sz w:val="24"/>
+          <w:szCs w:val="24"/>
+        </w:rPr>
+        <w:t>Le client se connecte avec ses nouveaux identifiants</w:t>
+      </w:r>
+    </w:p>
+    <w:p>
+      <w:pPr>
+        <w:tabs>
+          <w:tab w:val="left" w:pos="5560"/>
+        </w:tabs>
+        <w:ind w:left="360"/>
+        <w:rPr>
+          <w:rFonts w:ascii="Times New Roman" w:hAnsi="Times New Roman" w:cs="Times New Roman"/>
+          <w:sz w:val="24"/>
+          <w:szCs w:val="24"/>
+        </w:rPr>
+      </w:pPr>
+      <w:r>
+        <w:rPr>
+          <w:rFonts w:ascii="Times New Roman" w:hAnsi="Times New Roman" w:cs="Times New Roman"/>
+          <w:sz w:val="24"/>
+          <w:szCs w:val="24"/>
+        </w:rPr>
+        <w:t>Le système lui accorde l'accès</w:t>
+      </w:r>
+    </w:p>
+    <w:p>
+      <w:pPr>
+        <w:tabs>
+          <w:tab w:val="left" w:pos="5560"/>
+        </w:tabs>
+        <w:ind w:left="360"/>
+        <w:rPr>
+          <w:rFonts w:ascii="Times New Roman" w:hAnsi="Times New Roman" w:cs="Times New Roman"/>
+          <w:sz w:val="24"/>
+          <w:szCs w:val="24"/>
+        </w:rPr>
+      </w:pPr>
+      <w:r>
+        <w:rPr>
+          <w:rFonts w:ascii="Times New Roman" w:hAnsi="Times New Roman" w:cs="Times New Roman"/>
+          <w:sz w:val="24"/>
+          <w:szCs w:val="24"/>
+        </w:rPr>
         <w:t>Le client confirme son rendez-vous</w:t>
       </w:r>
     </w:p>
@@ -26182,6 +26430,7 @@
           <w:szCs w:val="24"/>
           <w:lang w:eastAsia="fr-FR"/>
         </w:rPr>
+        <w:lastRenderedPageBreak/>
         <w:t>Le système propose un autre créneau disponible</w:t>
       </w:r>
     </w:p>
@@ -26203,8 +26452,89 @@
           <w:szCs w:val="24"/>
           <w:lang w:eastAsia="fr-FR"/>
         </w:rPr>
+        <w:t>Le client recommence la sélection</w:t>
+      </w:r>
+    </w:p>
+    <w:p>
+      <w:pPr>
+        <w:spacing w:before="100" w:beforeAutospacing="1" w:after="100" w:afterAutospacing="1" w:line="240" w:lineRule="auto"/>
+        <w:ind w:firstLine="360"/>
+        <w:rPr>
+          <w:rFonts w:ascii="Times New Roman" w:eastAsia="Times New Roman" w:hAnsi="Times New Roman" w:cs="Times New Roman"/>
+          <w:sz w:val="24"/>
+          <w:szCs w:val="24"/>
+          <w:lang w:eastAsia="fr-FR"/>
+        </w:rPr>
+      </w:pPr>
+    </w:p>
+    <w:p>
+      <w:pPr>
+        <w:spacing w:before="100" w:beforeAutospacing="1" w:after="100" w:afterAutospacing="1" w:line="240" w:lineRule="auto"/>
+        <w:ind w:firstLine="360"/>
+        <w:rPr>
+          <w:rFonts w:ascii="Times New Roman" w:eastAsia="Times New Roman" w:hAnsi="Times New Roman" w:cs="Times New Roman"/>
+          <w:sz w:val="24"/>
+          <w:szCs w:val="24"/>
+          <w:lang w:eastAsia="fr-FR"/>
+        </w:rPr>
+      </w:pPr>
+      <w:r>
+        <w:rPr>
+          <w:rFonts w:ascii="Times New Roman" w:eastAsia="Times New Roman" w:hAnsi="Times New Roman" w:cs="Times New Roman"/>
+          <w:noProof/>
+          <w:sz w:val="24"/>
+          <w:szCs w:val="24"/>
+          <w:lang w:eastAsia="fr-FR"/>
+        </w:rPr>
         <w:lastRenderedPageBreak/>
-        <w:t>Le client recommence la sélection</w:t>
+        <w:drawing>
+          <wp:inline distT="0" distB="0" distL="0" distR="0">
+            <wp:extent cx="5324475" cy="9248140"/>
+            <wp:effectExtent l="0" t="0" r="9525" b="0"/>
+            <wp:docPr id="11" name="Image 11" descr="D:\l3\Memoire_De_Fin_Cycle\photo\clie.png"/>
+            <wp:cNvGraphicFramePr>
+              <a:graphicFrameLocks xmlns:a="http://schemas.openxmlformats.org/drawingml/2006/main" noChangeAspect="1"/>
+            </wp:cNvGraphicFramePr>
+            <a:graphic xmlns:a="http://schemas.openxmlformats.org/drawingml/2006/main">
+              <a:graphicData uri="http://schemas.openxmlformats.org/drawingml/2006/picture">
+                <pic:pic xmlns:pic="http://schemas.openxmlformats.org/drawingml/2006/picture">
+                  <pic:nvPicPr>
+                    <pic:cNvPr id="0" name="Picture 5" descr="D:\l3\Memoire_De_Fin_Cycle\photo\clie.png"/>
+                    <pic:cNvPicPr>
+                      <a:picLocks noChangeAspect="1" noChangeArrowheads="1"/>
+                    </pic:cNvPicPr>
+                  </pic:nvPicPr>
+                  <pic:blipFill>
+                    <a:blip r:embed="rId13">
+                      <a:extLst>
+                        <a:ext uri="{28A0092B-C50C-407E-A947-70E740481C1C}">
+                          <a14:useLocalDpi xmlns:a14="http://schemas.microsoft.com/office/drawing/2010/main" val="0"/>
+                        </a:ext>
+                      </a:extLst>
+                    </a:blip>
+                    <a:srcRect/>
+                    <a:stretch>
+                      <a:fillRect/>
+                    </a:stretch>
+                  </pic:blipFill>
+                  <pic:spPr bwMode="auto">
+                    <a:xfrm>
+                      <a:off x="0" y="0"/>
+                      <a:ext cx="5324475" cy="9248140"/>
+                    </a:xfrm>
+                    <a:prstGeom prst="rect">
+                      <a:avLst/>
+                    </a:prstGeom>
+                    <a:noFill/>
+                    <a:ln>
+                      <a:noFill/>
+                    </a:ln>
+                  </pic:spPr>
+                </pic:pic>
+              </a:graphicData>
+            </a:graphic>
+          </wp:inline>
+        </w:drawing>
       </w:r>
     </w:p>
     <w:p>
@@ -26317,7 +26647,7 @@
                     </pic:cNvPicPr>
                   </pic:nvPicPr>
                   <pic:blipFill>
-                    <a:blip r:embed="rId13">
+                    <a:blip r:embed="rId14">
                       <a:extLst>
                         <a:ext uri="{28A0092B-C50C-407E-A947-70E740481C1C}">
                           <a14:useLocalDpi xmlns:a14="http://schemas.microsoft.com/office/drawing/2010/main" val="0"/>
@@ -26431,6 +26761,14 @@
           <w:szCs w:val="24"/>
         </w:rPr>
       </w:pPr>
+      <w:r>
+        <w:rPr>
+          <w:rFonts w:ascii="Times New Roman" w:hAnsi="Times New Roman" w:cs="Times New Roman"/>
+          <w:sz w:val="24"/>
+          <w:szCs w:val="24"/>
+        </w:rPr>
+        <w:t>Description :</w:t>
+      </w:r>
     </w:p>
     <w:p>
       <w:pPr>
@@ -26447,6 +26785,652 @@
       <w:r>
         <w:rPr>
           <w:rFonts w:ascii="Times New Roman" w:hAnsi="Times New Roman" w:cs="Times New Roman"/>
+          <w:sz w:val="24"/>
+          <w:szCs w:val="24"/>
+        </w:rPr>
+        <w:t>Premier Partie : Identification</w:t>
+      </w:r>
+    </w:p>
+    <w:p>
+      <w:pPr>
+        <w:tabs>
+          <w:tab w:val="left" w:pos="5560"/>
+        </w:tabs>
+        <w:ind w:left="360"/>
+        <w:rPr>
+          <w:rFonts w:ascii="Times New Roman" w:hAnsi="Times New Roman" w:cs="Times New Roman"/>
+          <w:sz w:val="24"/>
+          <w:szCs w:val="24"/>
+        </w:rPr>
+      </w:pPr>
+      <w:r>
+        <w:rPr>
+          <w:rFonts w:ascii="Times New Roman" w:hAnsi="Times New Roman" w:cs="Times New Roman"/>
+          <w:sz w:val="24"/>
+          <w:szCs w:val="24"/>
+        </w:rPr>
+        <w:t>Nom : Gérer cycle intervention</w:t>
+      </w:r>
+    </w:p>
+    <w:p>
+      <w:pPr>
+        <w:tabs>
+          <w:tab w:val="left" w:pos="5560"/>
+        </w:tabs>
+        <w:ind w:left="360"/>
+        <w:rPr>
+          <w:rFonts w:ascii="Times New Roman" w:hAnsi="Times New Roman" w:cs="Times New Roman"/>
+          <w:sz w:val="24"/>
+          <w:szCs w:val="24"/>
+        </w:rPr>
+      </w:pPr>
+      <w:r>
+        <w:rPr>
+          <w:rFonts w:ascii="Times New Roman" w:hAnsi="Times New Roman" w:cs="Times New Roman"/>
+          <w:sz w:val="24"/>
+          <w:szCs w:val="24"/>
+        </w:rPr>
+        <w:t xml:space="preserve">Acteur : réceptionniste </w:t>
+      </w:r>
+    </w:p>
+    <w:p>
+      <w:pPr>
+        <w:tabs>
+          <w:tab w:val="left" w:pos="5560"/>
+        </w:tabs>
+        <w:ind w:left="360"/>
+        <w:rPr>
+          <w:rFonts w:ascii="Times New Roman" w:hAnsi="Times New Roman" w:cs="Times New Roman"/>
+          <w:sz w:val="24"/>
+          <w:szCs w:val="24"/>
+        </w:rPr>
+      </w:pPr>
+      <w:r>
+        <w:rPr>
+          <w:rFonts w:ascii="Times New Roman" w:hAnsi="Times New Roman" w:cs="Times New Roman"/>
+          <w:sz w:val="24"/>
+          <w:szCs w:val="24"/>
+        </w:rPr>
+        <w:t xml:space="preserve">Objectif : </w:t>
+      </w:r>
+      <w:r>
+        <w:rPr>
+          <w:rFonts w:ascii="Times New Roman" w:hAnsi="Times New Roman" w:cs="Times New Roman"/>
+          <w:sz w:val="24"/>
+          <w:szCs w:val="24"/>
+        </w:rPr>
+        <w:t>p</w:t>
+      </w:r>
+      <w:r>
+        <w:rPr>
+          <w:rFonts w:ascii="Times New Roman" w:hAnsi="Times New Roman" w:cs="Times New Roman"/>
+          <w:sz w:val="24"/>
+          <w:szCs w:val="24"/>
+        </w:rPr>
+        <w:t>e</w:t>
+      </w:r>
+      <w:r>
+        <w:rPr>
+          <w:rFonts w:ascii="Times New Roman" w:hAnsi="Times New Roman" w:cs="Times New Roman"/>
+          <w:sz w:val="24"/>
+          <w:szCs w:val="24"/>
+        </w:rPr>
+        <w:t>rmet au</w:t>
+      </w:r>
+      <w:r>
+        <w:rPr>
+          <w:rFonts w:ascii="Times New Roman" w:hAnsi="Times New Roman" w:cs="Times New Roman"/>
+          <w:sz w:val="24"/>
+          <w:szCs w:val="24"/>
+        </w:rPr>
+        <w:t xml:space="preserve"> </w:t>
+      </w:r>
+      <w:r>
+        <w:rPr>
+          <w:rFonts w:ascii="Times New Roman" w:hAnsi="Times New Roman" w:cs="Times New Roman"/>
+          <w:sz w:val="24"/>
+          <w:szCs w:val="24"/>
+        </w:rPr>
+        <w:t xml:space="preserve">réceptionniste </w:t>
+      </w:r>
+      <w:r>
+        <w:rPr>
+          <w:rFonts w:ascii="Times New Roman" w:hAnsi="Times New Roman" w:cs="Times New Roman"/>
+          <w:sz w:val="24"/>
+          <w:szCs w:val="24"/>
+        </w:rPr>
+        <w:t>de créer une intervention, de la suivre jusqu’à la génération d’une facture.</w:t>
+      </w:r>
+    </w:p>
+    <w:p>
+      <w:pPr>
+        <w:tabs>
+          <w:tab w:val="left" w:pos="5560"/>
+        </w:tabs>
+        <w:ind w:left="360"/>
+        <w:rPr>
+          <w:rFonts w:ascii="Times New Roman" w:hAnsi="Times New Roman" w:cs="Times New Roman"/>
+          <w:sz w:val="24"/>
+          <w:szCs w:val="24"/>
+        </w:rPr>
+      </w:pPr>
+      <w:r>
+        <w:rPr>
+          <w:rFonts w:ascii="Times New Roman" w:hAnsi="Times New Roman" w:cs="Times New Roman"/>
+          <w:sz w:val="24"/>
+          <w:szCs w:val="24"/>
+        </w:rPr>
+        <w:t>Deuxième partie : Description Scenario</w:t>
+      </w:r>
+    </w:p>
+    <w:p>
+      <w:pPr>
+        <w:tabs>
+          <w:tab w:val="left" w:pos="5560"/>
+        </w:tabs>
+        <w:ind w:left="360"/>
+        <w:rPr>
+          <w:rFonts w:ascii="Times New Roman" w:hAnsi="Times New Roman" w:cs="Times New Roman"/>
+          <w:sz w:val="24"/>
+          <w:szCs w:val="24"/>
+        </w:rPr>
+      </w:pPr>
+      <w:r>
+        <w:rPr>
+          <w:rFonts w:ascii="Times New Roman" w:hAnsi="Times New Roman" w:cs="Times New Roman"/>
+          <w:sz w:val="24"/>
+          <w:szCs w:val="24"/>
+        </w:rPr>
+        <w:lastRenderedPageBreak/>
+        <w:t xml:space="preserve">Précondition : </w:t>
+      </w:r>
+      <w:r>
+        <w:rPr>
+          <w:sz w:val="24"/>
+          <w:szCs w:val="24"/>
+        </w:rPr>
+        <w:t xml:space="preserve">le système doit garantir un état de </w:t>
+      </w:r>
+      <w:r>
+        <w:rPr>
+          <w:bCs/>
+          <w:sz w:val="24"/>
+          <w:szCs w:val="24"/>
+        </w:rPr>
+        <w:t>disponibilité immédiate</w:t>
+      </w:r>
+      <w:r>
+        <w:rPr>
+          <w:sz w:val="24"/>
+          <w:szCs w:val="24"/>
+        </w:rPr>
+        <w:t xml:space="preserve"> et de </w:t>
+      </w:r>
+      <w:r>
+        <w:rPr>
+          <w:bCs/>
+          <w:sz w:val="24"/>
+          <w:szCs w:val="24"/>
+        </w:rPr>
+        <w:t>sécurité</w:t>
+      </w:r>
+      <w:r>
+        <w:rPr>
+          <w:rFonts w:ascii="Times New Roman" w:hAnsi="Times New Roman" w:cs="Times New Roman"/>
+          <w:sz w:val="24"/>
+          <w:szCs w:val="24"/>
+        </w:rPr>
+        <w:t xml:space="preserve">. </w:t>
+      </w:r>
+    </w:p>
+    <w:p>
+      <w:pPr>
+        <w:tabs>
+          <w:tab w:val="left" w:pos="5560"/>
+        </w:tabs>
+        <w:ind w:left="360"/>
+        <w:rPr>
+          <w:rFonts w:ascii="Times New Roman" w:hAnsi="Times New Roman" w:cs="Times New Roman"/>
+          <w:sz w:val="24"/>
+          <w:szCs w:val="24"/>
+        </w:rPr>
+      </w:pPr>
+      <w:r>
+        <w:rPr>
+          <w:rFonts w:ascii="Times New Roman" w:hAnsi="Times New Roman" w:cs="Times New Roman"/>
+          <w:sz w:val="24"/>
+          <w:szCs w:val="24"/>
+        </w:rPr>
+        <w:t>L’enchainement des messages :</w:t>
+      </w:r>
+    </w:p>
+    <w:p>
+      <w:pPr>
+        <w:tabs>
+          <w:tab w:val="left" w:pos="5560"/>
+        </w:tabs>
+        <w:ind w:left="360"/>
+        <w:rPr>
+          <w:rFonts w:ascii="Times New Roman" w:hAnsi="Times New Roman" w:cs="Times New Roman"/>
+          <w:sz w:val="24"/>
+          <w:szCs w:val="24"/>
+        </w:rPr>
+      </w:pPr>
+      <w:r>
+        <w:rPr>
+          <w:rFonts w:ascii="Times New Roman" w:hAnsi="Times New Roman" w:cs="Times New Roman"/>
+          <w:sz w:val="24"/>
+          <w:szCs w:val="24"/>
+        </w:rPr>
+        <w:t>Le réceptionniste saisit ses identifiants</w:t>
+      </w:r>
+    </w:p>
+    <w:p>
+      <w:pPr>
+        <w:tabs>
+          <w:tab w:val="left" w:pos="5560"/>
+        </w:tabs>
+        <w:ind w:left="360"/>
+        <w:rPr>
+          <w:rFonts w:ascii="Times New Roman" w:hAnsi="Times New Roman" w:cs="Times New Roman"/>
+          <w:sz w:val="24"/>
+          <w:szCs w:val="24"/>
+        </w:rPr>
+      </w:pPr>
+      <w:r>
+        <w:rPr>
+          <w:rFonts w:ascii="Times New Roman" w:hAnsi="Times New Roman" w:cs="Times New Roman"/>
+          <w:sz w:val="24"/>
+          <w:szCs w:val="24"/>
+        </w:rPr>
+        <w:t>Le système lui accorde l'accès</w:t>
+      </w:r>
+    </w:p>
+    <w:p>
+      <w:pPr>
+        <w:tabs>
+          <w:tab w:val="left" w:pos="5560"/>
+        </w:tabs>
+        <w:ind w:left="360"/>
+        <w:rPr>
+          <w:rFonts w:ascii="Times New Roman" w:hAnsi="Times New Roman" w:cs="Times New Roman"/>
+          <w:sz w:val="24"/>
+          <w:szCs w:val="24"/>
+        </w:rPr>
+      </w:pPr>
+      <w:r>
+        <w:rPr>
+          <w:rFonts w:ascii="Times New Roman" w:hAnsi="Times New Roman" w:cs="Times New Roman"/>
+          <w:sz w:val="24"/>
+          <w:szCs w:val="24"/>
+        </w:rPr>
+        <w:t>Le réceptionniste recherche le client et son véhicule</w:t>
+      </w:r>
+    </w:p>
+    <w:p>
+      <w:pPr>
+        <w:tabs>
+          <w:tab w:val="left" w:pos="5560"/>
+        </w:tabs>
+        <w:ind w:left="360"/>
+        <w:rPr>
+          <w:rFonts w:ascii="Times New Roman" w:hAnsi="Times New Roman" w:cs="Times New Roman"/>
+          <w:sz w:val="24"/>
+          <w:szCs w:val="24"/>
+        </w:rPr>
+      </w:pPr>
+      <w:r>
+        <w:rPr>
+          <w:rFonts w:ascii="Times New Roman" w:hAnsi="Times New Roman" w:cs="Times New Roman"/>
+          <w:sz w:val="24"/>
+          <w:szCs w:val="24"/>
+        </w:rPr>
+        <w:t>Le système affiche la fiche client</w:t>
+      </w:r>
+    </w:p>
+    <w:p>
+      <w:pPr>
+        <w:tabs>
+          <w:tab w:val="left" w:pos="5560"/>
+        </w:tabs>
+        <w:ind w:left="360"/>
+        <w:rPr>
+          <w:rFonts w:ascii="Times New Roman" w:hAnsi="Times New Roman" w:cs="Times New Roman"/>
+          <w:sz w:val="24"/>
+          <w:szCs w:val="24"/>
+        </w:rPr>
+      </w:pPr>
+      <w:r>
+        <w:rPr>
+          <w:rFonts w:ascii="Times New Roman" w:hAnsi="Times New Roman" w:cs="Times New Roman"/>
+          <w:sz w:val="24"/>
+          <w:szCs w:val="24"/>
+        </w:rPr>
+        <w:t>Le réceptionniste crée l'ordre d'intervention</w:t>
+      </w:r>
+    </w:p>
+    <w:p>
+      <w:pPr>
+        <w:tabs>
+          <w:tab w:val="left" w:pos="5560"/>
+        </w:tabs>
+        <w:ind w:left="360"/>
+        <w:rPr>
+          <w:rFonts w:ascii="Times New Roman" w:hAnsi="Times New Roman" w:cs="Times New Roman"/>
+          <w:sz w:val="24"/>
+          <w:szCs w:val="24"/>
+        </w:rPr>
+      </w:pPr>
+      <w:r>
+        <w:rPr>
+          <w:rFonts w:ascii="Times New Roman" w:hAnsi="Times New Roman" w:cs="Times New Roman"/>
+          <w:sz w:val="24"/>
+          <w:szCs w:val="24"/>
+        </w:rPr>
+        <w:t>Le système confirme la création avec un numéro d'ordre</w:t>
+      </w:r>
+    </w:p>
+    <w:p>
+      <w:pPr>
+        <w:tabs>
+          <w:tab w:val="left" w:pos="5560"/>
+        </w:tabs>
+        <w:ind w:left="360"/>
+        <w:rPr>
+          <w:rFonts w:ascii="Times New Roman" w:hAnsi="Times New Roman" w:cs="Times New Roman"/>
+          <w:sz w:val="24"/>
+          <w:szCs w:val="24"/>
+        </w:rPr>
+      </w:pPr>
+      <w:r>
+        <w:rPr>
+          <w:rFonts w:ascii="Times New Roman" w:hAnsi="Times New Roman" w:cs="Times New Roman"/>
+          <w:sz w:val="24"/>
+          <w:szCs w:val="24"/>
+        </w:rPr>
+        <w:t>Le réceptionniste affecte l'ordre au département concerné</w:t>
+      </w:r>
+    </w:p>
+    <w:p>
+      <w:pPr>
+        <w:tabs>
+          <w:tab w:val="left" w:pos="5560"/>
+        </w:tabs>
+        <w:ind w:left="360"/>
+        <w:rPr>
+          <w:rFonts w:ascii="Times New Roman" w:hAnsi="Times New Roman" w:cs="Times New Roman"/>
+          <w:sz w:val="24"/>
+          <w:szCs w:val="24"/>
+        </w:rPr>
+      </w:pPr>
+      <w:r>
+        <w:rPr>
+          <w:rFonts w:ascii="Times New Roman" w:hAnsi="Times New Roman" w:cs="Times New Roman"/>
+          <w:sz w:val="24"/>
+          <w:szCs w:val="24"/>
+        </w:rPr>
+        <w:t>Le système confirme l'affectation</w:t>
+      </w:r>
+    </w:p>
+    <w:p>
+      <w:pPr>
+        <w:tabs>
+          <w:tab w:val="left" w:pos="5560"/>
+        </w:tabs>
+        <w:ind w:left="360"/>
+        <w:rPr>
+          <w:rFonts w:ascii="Times New Roman" w:hAnsi="Times New Roman" w:cs="Times New Roman"/>
+          <w:sz w:val="24"/>
+          <w:szCs w:val="24"/>
+        </w:rPr>
+      </w:pPr>
+      <w:r>
+        <w:rPr>
+          <w:rFonts w:ascii="Times New Roman" w:hAnsi="Times New Roman" w:cs="Times New Roman"/>
+          <w:sz w:val="24"/>
+          <w:szCs w:val="24"/>
+        </w:rPr>
+        <w:t>Le réceptionniste consulte l'avancement</w:t>
+      </w:r>
+    </w:p>
+    <w:p>
+      <w:pPr>
+        <w:tabs>
+          <w:tab w:val="left" w:pos="5560"/>
+        </w:tabs>
+        <w:ind w:left="360"/>
+        <w:rPr>
+          <w:rFonts w:ascii="Times New Roman" w:hAnsi="Times New Roman" w:cs="Times New Roman"/>
+          <w:sz w:val="24"/>
+          <w:szCs w:val="24"/>
+        </w:rPr>
+      </w:pPr>
+      <w:r>
+        <w:rPr>
+          <w:rFonts w:ascii="Times New Roman" w:hAnsi="Times New Roman" w:cs="Times New Roman"/>
+          <w:sz w:val="24"/>
+          <w:szCs w:val="24"/>
+        </w:rPr>
+        <w:t>Le système affiche le statut actuel</w:t>
+      </w:r>
+    </w:p>
+    <w:p>
+      <w:pPr>
+        <w:tabs>
+          <w:tab w:val="left" w:pos="5560"/>
+        </w:tabs>
+        <w:ind w:left="360"/>
+        <w:rPr>
+          <w:rFonts w:ascii="Times New Roman" w:hAnsi="Times New Roman" w:cs="Times New Roman"/>
+          <w:sz w:val="24"/>
+          <w:szCs w:val="24"/>
+        </w:rPr>
+      </w:pPr>
+      <w:r>
+        <w:rPr>
+          <w:rFonts w:ascii="Times New Roman" w:hAnsi="Times New Roman" w:cs="Times New Roman"/>
+          <w:sz w:val="24"/>
+          <w:szCs w:val="24"/>
+        </w:rPr>
+        <w:t>Le réceptionniste met à jour le statut</w:t>
+      </w:r>
+    </w:p>
+    <w:p>
+      <w:pPr>
+        <w:tabs>
+          <w:tab w:val="left" w:pos="5560"/>
+        </w:tabs>
+        <w:ind w:left="360"/>
+        <w:rPr>
+          <w:rFonts w:ascii="Times New Roman" w:hAnsi="Times New Roman" w:cs="Times New Roman"/>
+          <w:sz w:val="24"/>
+          <w:szCs w:val="24"/>
+        </w:rPr>
+      </w:pPr>
+      <w:r>
+        <w:rPr>
+          <w:rFonts w:ascii="Times New Roman" w:hAnsi="Times New Roman" w:cs="Times New Roman"/>
+          <w:sz w:val="24"/>
+          <w:szCs w:val="24"/>
+        </w:rPr>
+        <w:t>Le système confirme la mise à jour</w:t>
+      </w:r>
+    </w:p>
+    <w:p>
+      <w:pPr>
+        <w:tabs>
+          <w:tab w:val="left" w:pos="5560"/>
+        </w:tabs>
+        <w:ind w:left="360"/>
+        <w:rPr>
+          <w:rFonts w:ascii="Times New Roman" w:hAnsi="Times New Roman" w:cs="Times New Roman"/>
+          <w:sz w:val="24"/>
+          <w:szCs w:val="24"/>
+        </w:rPr>
+      </w:pPr>
+      <w:r>
+        <w:rPr>
+          <w:rFonts w:ascii="Times New Roman" w:hAnsi="Times New Roman" w:cs="Times New Roman"/>
+          <w:sz w:val="24"/>
+          <w:szCs w:val="24"/>
+        </w:rPr>
+        <w:t>Si les essais sont validés :</w:t>
+      </w:r>
+    </w:p>
+    <w:p>
+      <w:pPr>
+        <w:tabs>
+          <w:tab w:val="left" w:pos="5560"/>
+        </w:tabs>
+        <w:ind w:left="360"/>
+        <w:rPr>
+          <w:rFonts w:ascii="Times New Roman" w:hAnsi="Times New Roman" w:cs="Times New Roman"/>
+          <w:sz w:val="24"/>
+          <w:szCs w:val="24"/>
+        </w:rPr>
+      </w:pPr>
+      <w:r>
+        <w:rPr>
+          <w:rFonts w:ascii="Times New Roman" w:hAnsi="Times New Roman" w:cs="Times New Roman"/>
+          <w:sz w:val="24"/>
+          <w:szCs w:val="24"/>
+        </w:rPr>
+        <w:t>Le réceptionniste clôture l'intervention</w:t>
+      </w:r>
+    </w:p>
+    <w:p>
+      <w:pPr>
+        <w:tabs>
+          <w:tab w:val="left" w:pos="5560"/>
+        </w:tabs>
+        <w:ind w:left="360"/>
+        <w:rPr>
+          <w:rFonts w:ascii="Times New Roman" w:hAnsi="Times New Roman" w:cs="Times New Roman"/>
+          <w:sz w:val="24"/>
+          <w:szCs w:val="24"/>
+        </w:rPr>
+      </w:pPr>
+      <w:r>
+        <w:rPr>
+          <w:rFonts w:ascii="Times New Roman" w:hAnsi="Times New Roman" w:cs="Times New Roman"/>
+          <w:sz w:val="24"/>
+          <w:szCs w:val="24"/>
+        </w:rPr>
+        <w:t>Le système confirme la clôture</w:t>
+      </w:r>
+    </w:p>
+    <w:p>
+      <w:pPr>
+        <w:tabs>
+          <w:tab w:val="left" w:pos="5560"/>
+        </w:tabs>
+        <w:ind w:left="360"/>
+        <w:rPr>
+          <w:rFonts w:ascii="Times New Roman" w:hAnsi="Times New Roman" w:cs="Times New Roman"/>
+          <w:sz w:val="24"/>
+          <w:szCs w:val="24"/>
+        </w:rPr>
+      </w:pPr>
+      <w:r>
+        <w:rPr>
+          <w:rFonts w:ascii="Times New Roman" w:hAnsi="Times New Roman" w:cs="Times New Roman"/>
+          <w:sz w:val="24"/>
+          <w:szCs w:val="24"/>
+        </w:rPr>
+        <w:t>Si retour en atelier :</w:t>
+      </w:r>
+    </w:p>
+    <w:p>
+      <w:pPr>
+        <w:tabs>
+          <w:tab w:val="left" w:pos="5560"/>
+        </w:tabs>
+        <w:ind w:left="360"/>
+        <w:rPr>
+          <w:rFonts w:ascii="Times New Roman" w:hAnsi="Times New Roman" w:cs="Times New Roman"/>
+          <w:sz w:val="24"/>
+          <w:szCs w:val="24"/>
+        </w:rPr>
+      </w:pPr>
+      <w:r>
+        <w:rPr>
+          <w:rFonts w:ascii="Times New Roman" w:hAnsi="Times New Roman" w:cs="Times New Roman"/>
+          <w:sz w:val="24"/>
+          <w:szCs w:val="24"/>
+        </w:rPr>
+        <w:t>Le système notifie le retour en atelier</w:t>
+      </w:r>
+    </w:p>
+    <w:p>
+      <w:pPr>
+        <w:tabs>
+          <w:tab w:val="left" w:pos="5560"/>
+        </w:tabs>
+        <w:ind w:left="360"/>
+        <w:rPr>
+          <w:rFonts w:ascii="Times New Roman" w:hAnsi="Times New Roman" w:cs="Times New Roman"/>
+          <w:sz w:val="24"/>
+          <w:szCs w:val="24"/>
+        </w:rPr>
+      </w:pPr>
+      <w:r>
+        <w:rPr>
+          <w:rFonts w:ascii="Times New Roman" w:hAnsi="Times New Roman" w:cs="Times New Roman"/>
+          <w:sz w:val="24"/>
+          <w:szCs w:val="24"/>
+        </w:rPr>
+        <w:t>Le réceptionniste met à jour le statut</w:t>
+      </w:r>
+    </w:p>
+    <w:p>
+      <w:pPr>
+        <w:tabs>
+          <w:tab w:val="left" w:pos="5560"/>
+        </w:tabs>
+        <w:ind w:left="360"/>
+        <w:rPr>
+          <w:rFonts w:ascii="Times New Roman" w:hAnsi="Times New Roman" w:cs="Times New Roman"/>
+          <w:sz w:val="24"/>
+          <w:szCs w:val="24"/>
+        </w:rPr>
+      </w:pPr>
+      <w:r>
+        <w:rPr>
+          <w:rFonts w:ascii="Times New Roman" w:hAnsi="Times New Roman" w:cs="Times New Roman"/>
+          <w:sz w:val="24"/>
+          <w:szCs w:val="24"/>
+        </w:rPr>
+        <w:t>Le cycle de suivi recommence</w:t>
+      </w:r>
+    </w:p>
+    <w:p>
+      <w:pPr>
+        <w:tabs>
+          <w:tab w:val="left" w:pos="5560"/>
+        </w:tabs>
+        <w:ind w:left="360"/>
+        <w:rPr>
+          <w:rFonts w:ascii="Times New Roman" w:hAnsi="Times New Roman" w:cs="Times New Roman"/>
+          <w:sz w:val="24"/>
+          <w:szCs w:val="24"/>
+        </w:rPr>
+      </w:pPr>
+    </w:p>
+    <w:p>
+      <w:pPr>
+        <w:tabs>
+          <w:tab w:val="left" w:pos="5560"/>
+        </w:tabs>
+        <w:ind w:left="360"/>
+        <w:rPr>
+          <w:rFonts w:ascii="Times New Roman" w:hAnsi="Times New Roman" w:cs="Times New Roman"/>
+          <w:sz w:val="24"/>
+          <w:szCs w:val="24"/>
+        </w:rPr>
+      </w:pPr>
+      <w:r>
+        <w:rPr>
+          <w:rFonts w:ascii="Times New Roman" w:hAnsi="Times New Roman" w:cs="Times New Roman"/>
           <w:noProof/>
           <w:sz w:val="24"/>
           <w:szCs w:val="24"/>
@@ -26455,9 +27439,9 @@
         <w:lastRenderedPageBreak/>
         <w:drawing>
           <wp:inline distT="0" distB="0" distL="0" distR="0">
-            <wp:extent cx="5372100" cy="9194800"/>
-            <wp:effectExtent l="0" t="0" r="0" b="6350"/>
-            <wp:docPr id="16" name="Image 16" descr="D:\l3\Memoire_De_Fin_Cycle\photo\rec.png"/>
+            <wp:extent cx="5370187" cy="9212033"/>
+            <wp:effectExtent l="0" t="0" r="2540" b="8255"/>
+            <wp:docPr id="14" name="Image 14" descr="D:\l3\Memoire_De_Fin_Cycle\photo\rect.png"/>
             <wp:cNvGraphicFramePr>
               <a:graphicFrameLocks xmlns:a="http://schemas.openxmlformats.org/drawingml/2006/main" noChangeAspect="1"/>
             </wp:cNvGraphicFramePr>
@@ -26465,13 +27449,13 @@
               <a:graphicData uri="http://schemas.openxmlformats.org/drawingml/2006/picture">
                 <pic:pic xmlns:pic="http://schemas.openxmlformats.org/drawingml/2006/picture">
                   <pic:nvPicPr>
-                    <pic:cNvPr id="0" name="Picture 8" descr="D:\l3\Memoire_De_Fin_Cycle\photo\rec.png"/>
+                    <pic:cNvPr id="0" name="Picture 7" descr="D:\l3\Memoire_De_Fin_Cycle\photo\rect.png"/>
                     <pic:cNvPicPr>
                       <a:picLocks noChangeAspect="1" noChangeArrowheads="1"/>
                     </pic:cNvPicPr>
                   </pic:nvPicPr>
                   <pic:blipFill>
-                    <a:blip r:embed="rId14">
+                    <a:blip r:embed="rId15">
                       <a:extLst>
                         <a:ext uri="{28A0092B-C50C-407E-A947-70E740481C1C}">
                           <a14:useLocalDpi xmlns:a14="http://schemas.microsoft.com/office/drawing/2010/main" val="0"/>
@@ -26486,7 +27470,7 @@
                   <pic:spPr bwMode="auto">
                     <a:xfrm>
                       <a:off x="0" y="0"/>
-                      <a:ext cx="5372100" cy="9194800"/>
+                      <a:ext cx="5375327" cy="9220849"/>
                     </a:xfrm>
                     <a:prstGeom prst="rect">
                       <a:avLst/>
@@ -26518,672 +27502,6 @@
     </w:p>
     <w:p>
       <w:pPr>
-        <w:tabs>
-          <w:tab w:val="left" w:pos="5560"/>
-        </w:tabs>
-        <w:ind w:left="360"/>
-        <w:rPr>
-          <w:rFonts w:ascii="Times New Roman" w:hAnsi="Times New Roman" w:cs="Times New Roman"/>
-          <w:sz w:val="24"/>
-          <w:szCs w:val="24"/>
-        </w:rPr>
-      </w:pPr>
-      <w:r>
-        <w:rPr>
-          <w:rFonts w:ascii="Times New Roman" w:hAnsi="Times New Roman" w:cs="Times New Roman"/>
-          <w:sz w:val="24"/>
-          <w:szCs w:val="24"/>
-        </w:rPr>
-        <w:t>Description :</w:t>
-      </w:r>
-    </w:p>
-    <w:p>
-      <w:pPr>
-        <w:tabs>
-          <w:tab w:val="left" w:pos="5560"/>
-        </w:tabs>
-        <w:ind w:left="360"/>
-        <w:rPr>
-          <w:rFonts w:ascii="Times New Roman" w:hAnsi="Times New Roman" w:cs="Times New Roman"/>
-          <w:sz w:val="24"/>
-          <w:szCs w:val="24"/>
-        </w:rPr>
-      </w:pPr>
-      <w:r>
-        <w:rPr>
-          <w:rFonts w:ascii="Times New Roman" w:hAnsi="Times New Roman" w:cs="Times New Roman"/>
-          <w:sz w:val="24"/>
-          <w:szCs w:val="24"/>
-        </w:rPr>
-        <w:t>Premier Partie : Identification</w:t>
-      </w:r>
-    </w:p>
-    <w:p>
-      <w:pPr>
-        <w:tabs>
-          <w:tab w:val="left" w:pos="5560"/>
-        </w:tabs>
-        <w:ind w:left="360"/>
-        <w:rPr>
-          <w:rFonts w:ascii="Times New Roman" w:hAnsi="Times New Roman" w:cs="Times New Roman"/>
-          <w:sz w:val="24"/>
-          <w:szCs w:val="24"/>
-        </w:rPr>
-      </w:pPr>
-      <w:r>
-        <w:rPr>
-          <w:rFonts w:ascii="Times New Roman" w:hAnsi="Times New Roman" w:cs="Times New Roman"/>
-          <w:sz w:val="24"/>
-          <w:szCs w:val="24"/>
-        </w:rPr>
-        <w:t>Nom : Gérer cycle intervention</w:t>
-      </w:r>
-    </w:p>
-    <w:p>
-      <w:pPr>
-        <w:tabs>
-          <w:tab w:val="left" w:pos="5560"/>
-        </w:tabs>
-        <w:ind w:left="360"/>
-        <w:rPr>
-          <w:rFonts w:ascii="Times New Roman" w:hAnsi="Times New Roman" w:cs="Times New Roman"/>
-          <w:sz w:val="24"/>
-          <w:szCs w:val="24"/>
-        </w:rPr>
-      </w:pPr>
-      <w:r>
-        <w:rPr>
-          <w:rFonts w:ascii="Times New Roman" w:hAnsi="Times New Roman" w:cs="Times New Roman"/>
-          <w:sz w:val="24"/>
-          <w:szCs w:val="24"/>
-        </w:rPr>
-        <w:t xml:space="preserve">Acteur : réceptionniste </w:t>
-      </w:r>
-    </w:p>
-    <w:p>
-      <w:pPr>
-        <w:tabs>
-          <w:tab w:val="left" w:pos="5560"/>
-        </w:tabs>
-        <w:ind w:left="360"/>
-        <w:rPr>
-          <w:rFonts w:ascii="Times New Roman" w:hAnsi="Times New Roman" w:cs="Times New Roman"/>
-          <w:sz w:val="24"/>
-          <w:szCs w:val="24"/>
-        </w:rPr>
-      </w:pPr>
-      <w:r>
-        <w:rPr>
-          <w:rFonts w:ascii="Times New Roman" w:hAnsi="Times New Roman" w:cs="Times New Roman"/>
-          <w:sz w:val="24"/>
-          <w:szCs w:val="24"/>
-        </w:rPr>
-        <w:t xml:space="preserve">Objectif : </w:t>
-      </w:r>
-      <w:r>
-        <w:rPr>
-          <w:rFonts w:ascii="Times New Roman" w:hAnsi="Times New Roman" w:cs="Times New Roman"/>
-          <w:sz w:val="24"/>
-          <w:szCs w:val="24"/>
-        </w:rPr>
-        <w:t>p</w:t>
-      </w:r>
-      <w:r>
-        <w:rPr>
-          <w:rFonts w:ascii="Times New Roman" w:hAnsi="Times New Roman" w:cs="Times New Roman"/>
-          <w:sz w:val="24"/>
-          <w:szCs w:val="24"/>
-        </w:rPr>
-        <w:t>e</w:t>
-      </w:r>
-      <w:r>
-        <w:rPr>
-          <w:rFonts w:ascii="Times New Roman" w:hAnsi="Times New Roman" w:cs="Times New Roman"/>
-          <w:sz w:val="24"/>
-          <w:szCs w:val="24"/>
-        </w:rPr>
-        <w:t>rmet au</w:t>
-      </w:r>
-      <w:r>
-        <w:rPr>
-          <w:rFonts w:ascii="Times New Roman" w:hAnsi="Times New Roman" w:cs="Times New Roman"/>
-          <w:sz w:val="24"/>
-          <w:szCs w:val="24"/>
-        </w:rPr>
-        <w:t xml:space="preserve"> </w:t>
-      </w:r>
-      <w:r>
-        <w:rPr>
-          <w:rFonts w:ascii="Times New Roman" w:hAnsi="Times New Roman" w:cs="Times New Roman"/>
-          <w:sz w:val="24"/>
-          <w:szCs w:val="24"/>
-        </w:rPr>
-        <w:t xml:space="preserve">réceptionniste </w:t>
-      </w:r>
-      <w:r>
-        <w:rPr>
-          <w:rFonts w:ascii="Times New Roman" w:hAnsi="Times New Roman" w:cs="Times New Roman"/>
-          <w:sz w:val="24"/>
-          <w:szCs w:val="24"/>
-        </w:rPr>
-        <w:t>de créer une intervention, de la suivre jusqu’à la génération d’une facture.</w:t>
-      </w:r>
-    </w:p>
-    <w:p>
-      <w:pPr>
-        <w:tabs>
-          <w:tab w:val="left" w:pos="5560"/>
-        </w:tabs>
-        <w:ind w:left="360"/>
-        <w:rPr>
-          <w:rFonts w:ascii="Times New Roman" w:hAnsi="Times New Roman" w:cs="Times New Roman"/>
-          <w:sz w:val="24"/>
-          <w:szCs w:val="24"/>
-        </w:rPr>
-      </w:pPr>
-      <w:r>
-        <w:rPr>
-          <w:rFonts w:ascii="Times New Roman" w:hAnsi="Times New Roman" w:cs="Times New Roman"/>
-          <w:sz w:val="24"/>
-          <w:szCs w:val="24"/>
-        </w:rPr>
-        <w:t>Deuxième partie : Description Scenario</w:t>
-      </w:r>
-    </w:p>
-    <w:p>
-      <w:pPr>
-        <w:tabs>
-          <w:tab w:val="left" w:pos="5560"/>
-        </w:tabs>
-        <w:ind w:left="360"/>
-        <w:rPr>
-          <w:rFonts w:ascii="Times New Roman" w:hAnsi="Times New Roman" w:cs="Times New Roman"/>
-          <w:sz w:val="24"/>
-          <w:szCs w:val="24"/>
-        </w:rPr>
-      </w:pPr>
-      <w:r>
-        <w:rPr>
-          <w:rFonts w:ascii="Times New Roman" w:hAnsi="Times New Roman" w:cs="Times New Roman"/>
-          <w:sz w:val="24"/>
-          <w:szCs w:val="24"/>
-        </w:rPr>
-        <w:t xml:space="preserve">Précondition : </w:t>
-      </w:r>
-      <w:r>
-        <w:rPr>
-          <w:sz w:val="24"/>
-          <w:szCs w:val="24"/>
-        </w:rPr>
-        <w:t xml:space="preserve">le système doit garantir un état de </w:t>
-      </w:r>
-      <w:r>
-        <w:rPr>
-          <w:bCs/>
-          <w:sz w:val="24"/>
-          <w:szCs w:val="24"/>
-        </w:rPr>
-        <w:t>disponibilité immédiate</w:t>
-      </w:r>
-      <w:r>
-        <w:rPr>
-          <w:sz w:val="24"/>
-          <w:szCs w:val="24"/>
-        </w:rPr>
-        <w:t xml:space="preserve"> et de </w:t>
-      </w:r>
-      <w:r>
-        <w:rPr>
-          <w:bCs/>
-          <w:sz w:val="24"/>
-          <w:szCs w:val="24"/>
-        </w:rPr>
-        <w:t>sécurité</w:t>
-      </w:r>
-      <w:r>
-        <w:rPr>
-          <w:rFonts w:ascii="Times New Roman" w:hAnsi="Times New Roman" w:cs="Times New Roman"/>
-          <w:sz w:val="24"/>
-          <w:szCs w:val="24"/>
-        </w:rPr>
-        <w:t xml:space="preserve">. </w:t>
-      </w:r>
-    </w:p>
-    <w:p>
-      <w:pPr>
-        <w:tabs>
-          <w:tab w:val="left" w:pos="5560"/>
-        </w:tabs>
-        <w:ind w:left="360"/>
-        <w:rPr>
-          <w:rFonts w:ascii="Times New Roman" w:hAnsi="Times New Roman" w:cs="Times New Roman"/>
-          <w:sz w:val="24"/>
-          <w:szCs w:val="24"/>
-        </w:rPr>
-      </w:pPr>
-      <w:r>
-        <w:rPr>
-          <w:rFonts w:ascii="Times New Roman" w:hAnsi="Times New Roman" w:cs="Times New Roman"/>
-          <w:sz w:val="24"/>
-          <w:szCs w:val="24"/>
-        </w:rPr>
-        <w:t>L’enchainement des messages :</w:t>
-      </w:r>
-    </w:p>
-    <w:p>
-      <w:pPr>
-        <w:tabs>
-          <w:tab w:val="left" w:pos="5560"/>
-        </w:tabs>
-        <w:ind w:left="360"/>
-        <w:rPr>
-          <w:rFonts w:ascii="Times New Roman" w:hAnsi="Times New Roman" w:cs="Times New Roman"/>
-          <w:sz w:val="24"/>
-          <w:szCs w:val="24"/>
-        </w:rPr>
-      </w:pPr>
-      <w:r>
-        <w:rPr>
-          <w:rFonts w:ascii="Times New Roman" w:hAnsi="Times New Roman" w:cs="Times New Roman"/>
-          <w:sz w:val="24"/>
-          <w:szCs w:val="24"/>
-        </w:rPr>
-        <w:t>Le réceptionniste saisit ses identifiants</w:t>
-      </w:r>
-    </w:p>
-    <w:p>
-      <w:pPr>
-        <w:tabs>
-          <w:tab w:val="left" w:pos="5560"/>
-        </w:tabs>
-        <w:ind w:left="360"/>
-        <w:rPr>
-          <w:rFonts w:ascii="Times New Roman" w:hAnsi="Times New Roman" w:cs="Times New Roman"/>
-          <w:sz w:val="24"/>
-          <w:szCs w:val="24"/>
-        </w:rPr>
-      </w:pPr>
-      <w:r>
-        <w:rPr>
-          <w:rFonts w:ascii="Times New Roman" w:hAnsi="Times New Roman" w:cs="Times New Roman"/>
-          <w:sz w:val="24"/>
-          <w:szCs w:val="24"/>
-        </w:rPr>
-        <w:t>Le système lui accorde l'accès</w:t>
-      </w:r>
-    </w:p>
-    <w:p>
-      <w:pPr>
-        <w:tabs>
-          <w:tab w:val="left" w:pos="5560"/>
-        </w:tabs>
-        <w:ind w:left="360"/>
-        <w:rPr>
-          <w:rFonts w:ascii="Times New Roman" w:hAnsi="Times New Roman" w:cs="Times New Roman"/>
-          <w:sz w:val="24"/>
-          <w:szCs w:val="24"/>
-        </w:rPr>
-      </w:pPr>
-      <w:r>
-        <w:rPr>
-          <w:rFonts w:ascii="Times New Roman" w:hAnsi="Times New Roman" w:cs="Times New Roman"/>
-          <w:sz w:val="24"/>
-          <w:szCs w:val="24"/>
-        </w:rPr>
-        <w:t>Le réceptionniste recherche le client et son véhicule</w:t>
-      </w:r>
-    </w:p>
-    <w:p>
-      <w:pPr>
-        <w:tabs>
-          <w:tab w:val="left" w:pos="5560"/>
-        </w:tabs>
-        <w:ind w:left="360"/>
-        <w:rPr>
-          <w:rFonts w:ascii="Times New Roman" w:hAnsi="Times New Roman" w:cs="Times New Roman"/>
-          <w:sz w:val="24"/>
-          <w:szCs w:val="24"/>
-        </w:rPr>
-      </w:pPr>
-      <w:r>
-        <w:rPr>
-          <w:rFonts w:ascii="Times New Roman" w:hAnsi="Times New Roman" w:cs="Times New Roman"/>
-          <w:sz w:val="24"/>
-          <w:szCs w:val="24"/>
-        </w:rPr>
-        <w:t>Le système affiche la fiche client</w:t>
-      </w:r>
-    </w:p>
-    <w:p>
-      <w:pPr>
-        <w:tabs>
-          <w:tab w:val="left" w:pos="5560"/>
-        </w:tabs>
-        <w:ind w:left="360"/>
-        <w:rPr>
-          <w:rFonts w:ascii="Times New Roman" w:hAnsi="Times New Roman" w:cs="Times New Roman"/>
-          <w:sz w:val="24"/>
-          <w:szCs w:val="24"/>
-        </w:rPr>
-      </w:pPr>
-      <w:r>
-        <w:rPr>
-          <w:rFonts w:ascii="Times New Roman" w:hAnsi="Times New Roman" w:cs="Times New Roman"/>
-          <w:sz w:val="24"/>
-          <w:szCs w:val="24"/>
-        </w:rPr>
-        <w:t>Le réceptionniste crée l'ordre d'intervention</w:t>
-      </w:r>
-    </w:p>
-    <w:p>
-      <w:pPr>
-        <w:tabs>
-          <w:tab w:val="left" w:pos="5560"/>
-        </w:tabs>
-        <w:ind w:left="360"/>
-        <w:rPr>
-          <w:rFonts w:ascii="Times New Roman" w:hAnsi="Times New Roman" w:cs="Times New Roman"/>
-          <w:sz w:val="24"/>
-          <w:szCs w:val="24"/>
-        </w:rPr>
-      </w:pPr>
-      <w:r>
-        <w:rPr>
-          <w:rFonts w:ascii="Times New Roman" w:hAnsi="Times New Roman" w:cs="Times New Roman"/>
-          <w:sz w:val="24"/>
-          <w:szCs w:val="24"/>
-        </w:rPr>
-        <w:t>Le système confirme la création avec un numéro d'ordre</w:t>
-      </w:r>
-    </w:p>
-    <w:p>
-      <w:pPr>
-        <w:tabs>
-          <w:tab w:val="left" w:pos="5560"/>
-        </w:tabs>
-        <w:ind w:left="360"/>
-        <w:rPr>
-          <w:rFonts w:ascii="Times New Roman" w:hAnsi="Times New Roman" w:cs="Times New Roman"/>
-          <w:sz w:val="24"/>
-          <w:szCs w:val="24"/>
-        </w:rPr>
-      </w:pPr>
-      <w:r>
-        <w:rPr>
-          <w:rFonts w:ascii="Times New Roman" w:hAnsi="Times New Roman" w:cs="Times New Roman"/>
-          <w:sz w:val="24"/>
-          <w:szCs w:val="24"/>
-        </w:rPr>
-        <w:t>Le réceptionniste affecte l'ordre au département concerné</w:t>
-      </w:r>
-    </w:p>
-    <w:p>
-      <w:pPr>
-        <w:tabs>
-          <w:tab w:val="left" w:pos="5560"/>
-        </w:tabs>
-        <w:ind w:left="360"/>
-        <w:rPr>
-          <w:rFonts w:ascii="Times New Roman" w:hAnsi="Times New Roman" w:cs="Times New Roman"/>
-          <w:sz w:val="24"/>
-          <w:szCs w:val="24"/>
-        </w:rPr>
-      </w:pPr>
-      <w:r>
-        <w:rPr>
-          <w:rFonts w:ascii="Times New Roman" w:hAnsi="Times New Roman" w:cs="Times New Roman"/>
-          <w:sz w:val="24"/>
-          <w:szCs w:val="24"/>
-        </w:rPr>
-        <w:t>Le système confirme l'affectation</w:t>
-      </w:r>
-    </w:p>
-    <w:p>
-      <w:pPr>
-        <w:tabs>
-          <w:tab w:val="left" w:pos="5560"/>
-        </w:tabs>
-        <w:ind w:left="360"/>
-        <w:rPr>
-          <w:rFonts w:ascii="Times New Roman" w:hAnsi="Times New Roman" w:cs="Times New Roman"/>
-          <w:sz w:val="24"/>
-          <w:szCs w:val="24"/>
-        </w:rPr>
-      </w:pPr>
-      <w:r>
-        <w:rPr>
-          <w:rFonts w:ascii="Times New Roman" w:hAnsi="Times New Roman" w:cs="Times New Roman"/>
-          <w:sz w:val="24"/>
-          <w:szCs w:val="24"/>
-        </w:rPr>
-        <w:t>Le réceptionniste consulte l'avancement</w:t>
-      </w:r>
-    </w:p>
-    <w:p>
-      <w:pPr>
-        <w:tabs>
-          <w:tab w:val="left" w:pos="5560"/>
-        </w:tabs>
-        <w:ind w:left="360"/>
-        <w:rPr>
-          <w:rFonts w:ascii="Times New Roman" w:hAnsi="Times New Roman" w:cs="Times New Roman"/>
-          <w:sz w:val="24"/>
-          <w:szCs w:val="24"/>
-        </w:rPr>
-      </w:pPr>
-      <w:r>
-        <w:rPr>
-          <w:rFonts w:ascii="Times New Roman" w:hAnsi="Times New Roman" w:cs="Times New Roman"/>
-          <w:sz w:val="24"/>
-          <w:szCs w:val="24"/>
-        </w:rPr>
-        <w:t>Le système affiche le statut actuel</w:t>
-      </w:r>
-    </w:p>
-    <w:p>
-      <w:pPr>
-        <w:tabs>
-          <w:tab w:val="left" w:pos="5560"/>
-        </w:tabs>
-        <w:ind w:left="360"/>
-        <w:rPr>
-          <w:rFonts w:ascii="Times New Roman" w:hAnsi="Times New Roman" w:cs="Times New Roman"/>
-          <w:sz w:val="24"/>
-          <w:szCs w:val="24"/>
-        </w:rPr>
-      </w:pPr>
-      <w:r>
-        <w:rPr>
-          <w:rFonts w:ascii="Times New Roman" w:hAnsi="Times New Roman" w:cs="Times New Roman"/>
-          <w:sz w:val="24"/>
-          <w:szCs w:val="24"/>
-        </w:rPr>
-        <w:t>Le réceptionniste met à jour le statut</w:t>
-      </w:r>
-    </w:p>
-    <w:p>
-      <w:pPr>
-        <w:tabs>
-          <w:tab w:val="left" w:pos="5560"/>
-        </w:tabs>
-        <w:ind w:left="360"/>
-        <w:rPr>
-          <w:rFonts w:ascii="Times New Roman" w:hAnsi="Times New Roman" w:cs="Times New Roman"/>
-          <w:sz w:val="24"/>
-          <w:szCs w:val="24"/>
-        </w:rPr>
-      </w:pPr>
-      <w:r>
-        <w:rPr>
-          <w:rFonts w:ascii="Times New Roman" w:hAnsi="Times New Roman" w:cs="Times New Roman"/>
-          <w:sz w:val="24"/>
-          <w:szCs w:val="24"/>
-        </w:rPr>
-        <w:t>Le système confirme la mise à jour</w:t>
-      </w:r>
-    </w:p>
-    <w:p>
-      <w:pPr>
-        <w:tabs>
-          <w:tab w:val="left" w:pos="5560"/>
-        </w:tabs>
-        <w:ind w:left="360"/>
-        <w:rPr>
-          <w:rFonts w:ascii="Times New Roman" w:hAnsi="Times New Roman" w:cs="Times New Roman"/>
-          <w:sz w:val="24"/>
-          <w:szCs w:val="24"/>
-        </w:rPr>
-      </w:pPr>
-      <w:r>
-        <w:rPr>
-          <w:rFonts w:ascii="Times New Roman" w:hAnsi="Times New Roman" w:cs="Times New Roman"/>
-          <w:sz w:val="24"/>
-          <w:szCs w:val="24"/>
-        </w:rPr>
-        <w:t>Si les essais sont validés :</w:t>
-      </w:r>
-    </w:p>
-    <w:p>
-      <w:pPr>
-        <w:tabs>
-          <w:tab w:val="left" w:pos="5560"/>
-        </w:tabs>
-        <w:ind w:left="360"/>
-        <w:rPr>
-          <w:rFonts w:ascii="Times New Roman" w:hAnsi="Times New Roman" w:cs="Times New Roman"/>
-          <w:sz w:val="24"/>
-          <w:szCs w:val="24"/>
-        </w:rPr>
-      </w:pPr>
-      <w:r>
-        <w:rPr>
-          <w:rFonts w:ascii="Times New Roman" w:hAnsi="Times New Roman" w:cs="Times New Roman"/>
-          <w:sz w:val="24"/>
-          <w:szCs w:val="24"/>
-        </w:rPr>
-        <w:t>Le réceptionniste clôture l'intervention</w:t>
-      </w:r>
-    </w:p>
-    <w:p>
-      <w:pPr>
-        <w:tabs>
-          <w:tab w:val="left" w:pos="5560"/>
-        </w:tabs>
-        <w:ind w:left="360"/>
-        <w:rPr>
-          <w:rFonts w:ascii="Times New Roman" w:hAnsi="Times New Roman" w:cs="Times New Roman"/>
-          <w:sz w:val="24"/>
-          <w:szCs w:val="24"/>
-        </w:rPr>
-      </w:pPr>
-      <w:r>
-        <w:rPr>
-          <w:rFonts w:ascii="Times New Roman" w:hAnsi="Times New Roman" w:cs="Times New Roman"/>
-          <w:sz w:val="24"/>
-          <w:szCs w:val="24"/>
-        </w:rPr>
-        <w:t>Le système confirme la clôture</w:t>
-      </w:r>
-    </w:p>
-    <w:p>
-      <w:pPr>
-        <w:tabs>
-          <w:tab w:val="left" w:pos="5560"/>
-        </w:tabs>
-        <w:ind w:left="360"/>
-        <w:rPr>
-          <w:rFonts w:ascii="Times New Roman" w:hAnsi="Times New Roman" w:cs="Times New Roman"/>
-          <w:sz w:val="24"/>
-          <w:szCs w:val="24"/>
-        </w:rPr>
-      </w:pPr>
-      <w:r>
-        <w:rPr>
-          <w:rFonts w:ascii="Times New Roman" w:hAnsi="Times New Roman" w:cs="Times New Roman"/>
-          <w:sz w:val="24"/>
-          <w:szCs w:val="24"/>
-        </w:rPr>
-        <w:t>Si retour en atelier :</w:t>
-      </w:r>
-    </w:p>
-    <w:p>
-      <w:pPr>
-        <w:tabs>
-          <w:tab w:val="left" w:pos="5560"/>
-        </w:tabs>
-        <w:ind w:left="360"/>
-        <w:rPr>
-          <w:rFonts w:ascii="Times New Roman" w:hAnsi="Times New Roman" w:cs="Times New Roman"/>
-          <w:sz w:val="24"/>
-          <w:szCs w:val="24"/>
-        </w:rPr>
-      </w:pPr>
-      <w:r>
-        <w:rPr>
-          <w:rFonts w:ascii="Times New Roman" w:hAnsi="Times New Roman" w:cs="Times New Roman"/>
-          <w:sz w:val="24"/>
-          <w:szCs w:val="24"/>
-        </w:rPr>
-        <w:t>Le système notifie le retour en atelier</w:t>
-      </w:r>
-    </w:p>
-    <w:p>
-      <w:pPr>
-        <w:tabs>
-          <w:tab w:val="left" w:pos="5560"/>
-        </w:tabs>
-        <w:ind w:left="360"/>
-        <w:rPr>
-          <w:rFonts w:ascii="Times New Roman" w:hAnsi="Times New Roman" w:cs="Times New Roman"/>
-          <w:sz w:val="24"/>
-          <w:szCs w:val="24"/>
-        </w:rPr>
-      </w:pPr>
-      <w:r>
-        <w:rPr>
-          <w:rFonts w:ascii="Times New Roman" w:hAnsi="Times New Roman" w:cs="Times New Roman"/>
-          <w:sz w:val="24"/>
-          <w:szCs w:val="24"/>
-        </w:rPr>
-        <w:t>Le réceptionniste met à jour le statut</w:t>
-      </w:r>
-    </w:p>
-    <w:p>
-      <w:pPr>
-        <w:tabs>
-          <w:tab w:val="left" w:pos="5560"/>
-        </w:tabs>
-        <w:ind w:left="360"/>
-        <w:rPr>
-          <w:rFonts w:ascii="Times New Roman" w:hAnsi="Times New Roman" w:cs="Times New Roman"/>
-          <w:sz w:val="24"/>
-          <w:szCs w:val="24"/>
-        </w:rPr>
-      </w:pPr>
-      <w:r>
-        <w:rPr>
-          <w:rFonts w:ascii="Times New Roman" w:hAnsi="Times New Roman" w:cs="Times New Roman"/>
-          <w:sz w:val="24"/>
-          <w:szCs w:val="24"/>
-        </w:rPr>
-        <w:t>Le cycle de suivi recommence</w:t>
-      </w:r>
-    </w:p>
-    <w:p>
-      <w:pPr>
-        <w:tabs>
-          <w:tab w:val="left" w:pos="5560"/>
-        </w:tabs>
-        <w:ind w:left="360"/>
-        <w:rPr>
-          <w:rFonts w:ascii="Times New Roman" w:hAnsi="Times New Roman" w:cs="Times New Roman"/>
-          <w:sz w:val="24"/>
-          <w:szCs w:val="24"/>
-        </w:rPr>
-      </w:pPr>
-    </w:p>
-    <w:p>
-      <w:pPr>
         <w:pStyle w:val="Paragraphedeliste"/>
         <w:numPr>
           <w:ilvl w:val="1"/>
@@ -27259,7 +27577,6 @@
           <w:szCs w:val="24"/>
           <w:lang w:eastAsia="fr-FR"/>
         </w:rPr>
-        <w:lastRenderedPageBreak/>
         <w:drawing>
           <wp:inline distT="0" distB="0" distL="0" distR="0">
             <wp:extent cx="5760720" cy="4927055"/>
@@ -27278,7 +27595,7 @@
                     </pic:cNvPicPr>
                   </pic:nvPicPr>
                   <pic:blipFill>
-                    <a:blip r:embed="rId15">
+                    <a:blip r:embed="rId16">
                       <a:extLst>
                         <a:ext uri="{28A0092B-C50C-407E-A947-70E740481C1C}">
                           <a14:useLocalDpi xmlns:a14="http://schemas.microsoft.com/office/drawing/2010/main" val="0"/>
@@ -27364,17 +27681,214 @@
       <w:r>
         <w:rPr>
           <w:rFonts w:ascii="Times New Roman" w:hAnsi="Times New Roman" w:cs="Times New Roman"/>
+          <w:sz w:val="24"/>
+          <w:szCs w:val="24"/>
+        </w:rPr>
+        <w:t xml:space="preserve"> </w:t>
+      </w:r>
+    </w:p>
+    <w:p>
+      <w:pPr>
+        <w:tabs>
+          <w:tab w:val="left" w:pos="5560"/>
+        </w:tabs>
+        <w:ind w:left="360"/>
+        <w:rPr>
+          <w:rFonts w:ascii="Times New Roman" w:hAnsi="Times New Roman" w:cs="Times New Roman"/>
+          <w:sz w:val="24"/>
+          <w:szCs w:val="24"/>
+        </w:rPr>
+      </w:pPr>
+      <w:r>
+        <w:rPr>
+          <w:rFonts w:ascii="Times New Roman" w:hAnsi="Times New Roman" w:cs="Times New Roman"/>
+          <w:sz w:val="24"/>
+          <w:szCs w:val="24"/>
+        </w:rPr>
+        <w:t>Description :</w:t>
+      </w:r>
+    </w:p>
+    <w:p>
+      <w:pPr>
+        <w:tabs>
+          <w:tab w:val="left" w:pos="5560"/>
+        </w:tabs>
+        <w:ind w:left="360"/>
+      </w:pPr>
+      <w:r>
+        <w:t>Le chef de département saisit ses identifiants</w:t>
+      </w:r>
+    </w:p>
+    <w:p>
+      <w:pPr>
+        <w:tabs>
+          <w:tab w:val="left" w:pos="5560"/>
+        </w:tabs>
+        <w:ind w:left="360"/>
+      </w:pPr>
+      <w:r>
+        <w:t>Le système lui accorde l'accès</w:t>
+      </w:r>
+    </w:p>
+    <w:p>
+      <w:pPr>
+        <w:tabs>
+          <w:tab w:val="left" w:pos="5560"/>
+        </w:tabs>
+        <w:ind w:left="360"/>
+      </w:pPr>
+      <w:r>
+        <w:t>Le chef consulte l'intervention en cours</w:t>
+      </w:r>
+    </w:p>
+    <w:p>
+      <w:pPr>
+        <w:tabs>
+          <w:tab w:val="left" w:pos="5560"/>
+        </w:tabs>
+        <w:ind w:left="360"/>
+      </w:pPr>
+      <w:r>
+        <w:t>Le système affiche les détails (diagnostic, travaux prévus)</w:t>
+      </w:r>
+    </w:p>
+    <w:p>
+      <w:pPr>
+        <w:tabs>
+          <w:tab w:val="left" w:pos="5560"/>
+        </w:tabs>
+        <w:ind w:left="360"/>
+      </w:pPr>
+      <w:r>
+        <w:t>Le chef ajuste le diagnostic suite à un problème découvert pendant les travaux</w:t>
+      </w:r>
+    </w:p>
+    <w:p>
+      <w:pPr>
+        <w:tabs>
+          <w:tab w:val="left" w:pos="5560"/>
+        </w:tabs>
+        <w:ind w:left="360"/>
+      </w:pPr>
+      <w:r>
+        <w:t>Le système confirme l'ajustement</w:t>
+      </w:r>
+    </w:p>
+    <w:p>
+      <w:pPr>
+        <w:tabs>
+          <w:tab w:val="left" w:pos="5560"/>
+        </w:tabs>
+        <w:ind w:left="360"/>
+      </w:pPr>
+      <w:r>
+        <w:lastRenderedPageBreak/>
+        <w:t>Le chef contrôle l'avancement des travaux</w:t>
+      </w:r>
+    </w:p>
+    <w:p>
+      <w:pPr>
+        <w:tabs>
+          <w:tab w:val="left" w:pos="5560"/>
+        </w:tabs>
+        <w:ind w:left="360"/>
+      </w:pPr>
+      <w:r>
+        <w:t>Le système affiche l'état de progression</w:t>
+      </w:r>
+    </w:p>
+    <w:p>
+      <w:pPr>
+        <w:tabs>
+          <w:tab w:val="left" w:pos="5560"/>
+        </w:tabs>
+        <w:ind w:left="360"/>
+      </w:pPr>
+      <w:r>
+        <w:t>Le chef met à jour le statut de l'intervention</w:t>
+      </w:r>
+    </w:p>
+    <w:p>
+      <w:pPr>
+        <w:tabs>
+          <w:tab w:val="left" w:pos="5560"/>
+        </w:tabs>
+        <w:ind w:left="360"/>
+      </w:pPr>
+      <w:r>
+        <w:t>Le système confirme la mise à jour</w:t>
+      </w:r>
+    </w:p>
+    <w:p>
+      <w:pPr>
+        <w:tabs>
+          <w:tab w:val="left" w:pos="5560"/>
+        </w:tabs>
+        <w:ind w:left="360"/>
+      </w:pPr>
+      <w:r>
+        <w:t>Le chef saisit les pièces consommées</w:t>
+      </w:r>
+    </w:p>
+    <w:p>
+      <w:pPr>
+        <w:tabs>
+          <w:tab w:val="left" w:pos="5560"/>
+        </w:tabs>
+        <w:ind w:left="360"/>
+      </w:pPr>
+      <w:r>
+        <w:t>Le système met à jour le stock automatiquement</w:t>
+      </w:r>
+    </w:p>
+    <w:p>
+      <w:pPr>
+        <w:tabs>
+          <w:tab w:val="left" w:pos="5560"/>
+        </w:tabs>
+        <w:ind w:left="360"/>
+      </w:pPr>
+      <w:r>
+        <w:t>Le système confirme l'enregistrement</w:t>
+      </w:r>
+    </w:p>
+    <w:p>
+      <w:pPr>
+        <w:tabs>
+          <w:tab w:val="left" w:pos="5560"/>
+        </w:tabs>
+        <w:ind w:left="360"/>
+      </w:pPr>
+      <w:r>
+        <w:t>Le chef termine la supervision en marquant l'intervention comme terminée</w:t>
+      </w:r>
+    </w:p>
+    <w:p>
+      <w:pPr>
+        <w:tabs>
+          <w:tab w:val="left" w:pos="5560"/>
+        </w:tabs>
+        <w:ind w:left="360"/>
+      </w:pPr>
+    </w:p>
+    <w:p>
+      <w:pPr>
+        <w:tabs>
+          <w:tab w:val="left" w:pos="5560"/>
+        </w:tabs>
+        <w:ind w:left="360"/>
+      </w:pPr>
+      <w:r>
+        <w:rPr>
           <w:noProof/>
-          <w:sz w:val="24"/>
-          <w:szCs w:val="24"/>
           <w:lang w:eastAsia="fr-FR"/>
         </w:rPr>
         <w:lastRenderedPageBreak/>
         <w:drawing>
           <wp:inline distT="0" distB="0" distL="0" distR="0">
-            <wp:extent cx="5715000" cy="9480550"/>
-            <wp:effectExtent l="0" t="0" r="0" b="6350"/>
-            <wp:docPr id="20" name="Image 20" descr="D:\l3\Memoire_De_Fin_Cycle\photo\cd1.png"/>
+            <wp:extent cx="5579110" cy="8409305"/>
+            <wp:effectExtent l="0" t="0" r="2540" b="0"/>
+            <wp:docPr id="15" name="Image 15" descr="D:\l3\Memoire_De_Fin_Cycle\photo\cdpt.png"/>
             <wp:cNvGraphicFramePr>
               <a:graphicFrameLocks xmlns:a="http://schemas.openxmlformats.org/drawingml/2006/main" noChangeAspect="1"/>
             </wp:cNvGraphicFramePr>
@@ -27382,13 +27896,13 @@
               <a:graphicData uri="http://schemas.openxmlformats.org/drawingml/2006/picture">
                 <pic:pic xmlns:pic="http://schemas.openxmlformats.org/drawingml/2006/picture">
                   <pic:nvPicPr>
-                    <pic:cNvPr id="0" name="Picture 11" descr="D:\l3\Memoire_De_Fin_Cycle\photo\cd1.png"/>
+                    <pic:cNvPr id="0" name="Picture 8" descr="D:\l3\Memoire_De_Fin_Cycle\photo\cdpt.png"/>
                     <pic:cNvPicPr>
                       <a:picLocks noChangeAspect="1" noChangeArrowheads="1"/>
                     </pic:cNvPicPr>
                   </pic:nvPicPr>
                   <pic:blipFill>
-                    <a:blip r:embed="rId16">
+                    <a:blip r:embed="rId17">
                       <a:extLst>
                         <a:ext uri="{28A0092B-C50C-407E-A947-70E740481C1C}">
                           <a14:useLocalDpi xmlns:a14="http://schemas.microsoft.com/office/drawing/2010/main" val="0"/>
@@ -27403,7 +27917,7 @@
                   <pic:spPr bwMode="auto">
                     <a:xfrm>
                       <a:off x="0" y="0"/>
-                      <a:ext cx="5715000" cy="9480550"/>
+                      <a:ext cx="5579110" cy="8409305"/>
                     </a:xfrm>
                     <a:prstGeom prst="rect">
                       <a:avLst/>
@@ -27419,192 +27933,6 @@
           </wp:inline>
         </w:drawing>
       </w:r>
-      <w:r>
-        <w:rPr>
-          <w:rFonts w:ascii="Times New Roman" w:hAnsi="Times New Roman" w:cs="Times New Roman"/>
-          <w:sz w:val="24"/>
-          <w:szCs w:val="24"/>
-        </w:rPr>
-        <w:t xml:space="preserve"> </w:t>
-      </w:r>
-      <w:bookmarkStart w:id="0" w:name="_GoBack"/>
-      <w:bookmarkEnd w:id="0"/>
-    </w:p>
-    <w:p>
-      <w:pPr>
-        <w:tabs>
-          <w:tab w:val="left" w:pos="5560"/>
-        </w:tabs>
-        <w:ind w:left="360"/>
-        <w:rPr>
-          <w:rFonts w:ascii="Times New Roman" w:hAnsi="Times New Roman" w:cs="Times New Roman"/>
-          <w:sz w:val="24"/>
-          <w:szCs w:val="24"/>
-        </w:rPr>
-      </w:pPr>
-      <w:r>
-        <w:rPr>
-          <w:rFonts w:ascii="Times New Roman" w:hAnsi="Times New Roman" w:cs="Times New Roman"/>
-          <w:sz w:val="24"/>
-          <w:szCs w:val="24"/>
-        </w:rPr>
-        <w:lastRenderedPageBreak/>
-        <w:t>Description :</w:t>
-      </w:r>
-    </w:p>
-    <w:p>
-      <w:pPr>
-        <w:tabs>
-          <w:tab w:val="left" w:pos="5560"/>
-        </w:tabs>
-        <w:ind w:left="360"/>
-      </w:pPr>
-      <w:r>
-        <w:t>Le chef de département saisit ses identifiants</w:t>
-      </w:r>
-    </w:p>
-    <w:p>
-      <w:pPr>
-        <w:tabs>
-          <w:tab w:val="left" w:pos="5560"/>
-        </w:tabs>
-        <w:ind w:left="360"/>
-      </w:pPr>
-      <w:r>
-        <w:t>Le système lui accorde l'accès</w:t>
-      </w:r>
-    </w:p>
-    <w:p>
-      <w:pPr>
-        <w:tabs>
-          <w:tab w:val="left" w:pos="5560"/>
-        </w:tabs>
-        <w:ind w:left="360"/>
-      </w:pPr>
-      <w:r>
-        <w:t>Le chef consulte l'intervention en cours</w:t>
-      </w:r>
-    </w:p>
-    <w:p>
-      <w:pPr>
-        <w:tabs>
-          <w:tab w:val="left" w:pos="5560"/>
-        </w:tabs>
-        <w:ind w:left="360"/>
-      </w:pPr>
-      <w:r>
-        <w:t>Le système affiche les détails (diagnostic, travaux prévus)</w:t>
-      </w:r>
-    </w:p>
-    <w:p>
-      <w:pPr>
-        <w:tabs>
-          <w:tab w:val="left" w:pos="5560"/>
-        </w:tabs>
-        <w:ind w:left="360"/>
-      </w:pPr>
-      <w:r>
-        <w:t>Le chef ajuste le diagnostic suite à un problème découvert pendant les travaux</w:t>
-      </w:r>
-    </w:p>
-    <w:p>
-      <w:pPr>
-        <w:tabs>
-          <w:tab w:val="left" w:pos="5560"/>
-        </w:tabs>
-        <w:ind w:left="360"/>
-      </w:pPr>
-      <w:r>
-        <w:t>Le système confirme l'ajustement</w:t>
-      </w:r>
-    </w:p>
-    <w:p>
-      <w:pPr>
-        <w:tabs>
-          <w:tab w:val="left" w:pos="5560"/>
-        </w:tabs>
-        <w:ind w:left="360"/>
-      </w:pPr>
-      <w:r>
-        <w:t>Le chef contrôle l'avancement des travaux</w:t>
-      </w:r>
-    </w:p>
-    <w:p>
-      <w:pPr>
-        <w:tabs>
-          <w:tab w:val="left" w:pos="5560"/>
-        </w:tabs>
-        <w:ind w:left="360"/>
-      </w:pPr>
-      <w:r>
-        <w:t>Le système affiche l'état de progression</w:t>
-      </w:r>
-    </w:p>
-    <w:p>
-      <w:pPr>
-        <w:tabs>
-          <w:tab w:val="left" w:pos="5560"/>
-        </w:tabs>
-        <w:ind w:left="360"/>
-      </w:pPr>
-      <w:r>
-        <w:t>Le chef met à jour le statut de l'intervention</w:t>
-      </w:r>
-    </w:p>
-    <w:p>
-      <w:pPr>
-        <w:tabs>
-          <w:tab w:val="left" w:pos="5560"/>
-        </w:tabs>
-        <w:ind w:left="360"/>
-      </w:pPr>
-      <w:r>
-        <w:t>Le système confirme la mise à jour</w:t>
-      </w:r>
-    </w:p>
-    <w:p>
-      <w:pPr>
-        <w:tabs>
-          <w:tab w:val="left" w:pos="5560"/>
-        </w:tabs>
-        <w:ind w:left="360"/>
-      </w:pPr>
-      <w:r>
-        <w:t>Le chef saisit les pièces consommées</w:t>
-      </w:r>
-    </w:p>
-    <w:p>
-      <w:pPr>
-        <w:tabs>
-          <w:tab w:val="left" w:pos="5560"/>
-        </w:tabs>
-        <w:ind w:left="360"/>
-      </w:pPr>
-      <w:r>
-        <w:t>Le système met à jour le stock automatiquement</w:t>
-      </w:r>
-    </w:p>
-    <w:p>
-      <w:pPr>
-        <w:tabs>
-          <w:tab w:val="left" w:pos="5560"/>
-        </w:tabs>
-        <w:ind w:left="360"/>
-      </w:pPr>
-      <w:r>
-        <w:t>Le système confirme l'enregistrement</w:t>
-      </w:r>
-    </w:p>
-    <w:p>
-      <w:pPr>
-        <w:tabs>
-          <w:tab w:val="left" w:pos="5560"/>
-        </w:tabs>
-        <w:ind w:left="360"/>
-      </w:pPr>
-      <w:r>
-        <w:t>Le chef termine la supervision en marquant l'intervention comme terminée</w:t>
-      </w:r>
     </w:p>
     <w:p>
       <w:pPr>
@@ -27641,6 +27969,7 @@
           <w:sz w:val="24"/>
           <w:szCs w:val="24"/>
         </w:rPr>
+        <w:lastRenderedPageBreak/>
         <w:t>Diagramme de cas</w:t>
       </w:r>
       <w:r>
@@ -27696,7 +28025,6 @@
           <w:szCs w:val="24"/>
           <w:lang w:eastAsia="fr-FR"/>
         </w:rPr>
-        <w:lastRenderedPageBreak/>
         <w:drawing>
           <wp:inline distT="0" distB="0" distL="0" distR="0">
             <wp:extent cx="5760720" cy="3996944"/>
@@ -27715,7 +28043,7 @@
                     </pic:cNvPicPr>
                   </pic:nvPicPr>
                   <pic:blipFill>
-                    <a:blip r:embed="rId17">
+                    <a:blip r:embed="rId18">
                       <a:extLst>
                         <a:ext uri="{28A0092B-C50C-407E-A947-70E740481C1C}">
                           <a14:useLocalDpi xmlns:a14="http://schemas.microsoft.com/office/drawing/2010/main" val="0"/>
@@ -27798,6 +28126,309 @@
           <w:szCs w:val="24"/>
         </w:rPr>
       </w:pPr>
+    </w:p>
+    <w:p>
+      <w:pPr>
+        <w:tabs>
+          <w:tab w:val="left" w:pos="5560"/>
+        </w:tabs>
+        <w:ind w:left="360"/>
+        <w:rPr>
+          <w:rFonts w:ascii="Times New Roman" w:hAnsi="Times New Roman" w:cs="Times New Roman"/>
+          <w:sz w:val="24"/>
+          <w:szCs w:val="24"/>
+        </w:rPr>
+      </w:pPr>
+    </w:p>
+    <w:p>
+      <w:pPr>
+        <w:tabs>
+          <w:tab w:val="left" w:pos="5560"/>
+        </w:tabs>
+        <w:ind w:left="360"/>
+        <w:rPr>
+          <w:rFonts w:ascii="Times New Roman" w:hAnsi="Times New Roman" w:cs="Times New Roman"/>
+          <w:sz w:val="24"/>
+          <w:szCs w:val="24"/>
+        </w:rPr>
+      </w:pPr>
+      <w:r>
+        <w:rPr>
+          <w:rFonts w:ascii="Times New Roman" w:hAnsi="Times New Roman" w:cs="Times New Roman"/>
+          <w:sz w:val="24"/>
+          <w:szCs w:val="24"/>
+        </w:rPr>
+        <w:t>Description :</w:t>
+      </w:r>
+    </w:p>
+    <w:p>
+      <w:pPr>
+        <w:tabs>
+          <w:tab w:val="left" w:pos="5560"/>
+        </w:tabs>
+        <w:ind w:left="360"/>
+      </w:pPr>
+      <w:r>
+        <w:t>Le directeur technique (ou chef de département) saisit ses identifiants</w:t>
+      </w:r>
+    </w:p>
+    <w:p>
+      <w:pPr>
+        <w:tabs>
+          <w:tab w:val="left" w:pos="5560"/>
+        </w:tabs>
+        <w:ind w:left="360"/>
+      </w:pPr>
+      <w:r>
+        <w:t>Le système lui accorde l'accès</w:t>
+      </w:r>
+    </w:p>
+    <w:p>
+      <w:pPr>
+        <w:tabs>
+          <w:tab w:val="left" w:pos="5560"/>
+        </w:tabs>
+        <w:ind w:left="360"/>
+      </w:pPr>
+      <w:r>
+        <w:t>Il consulte la liste des interventions terminées</w:t>
+      </w:r>
+    </w:p>
+    <w:p>
+      <w:pPr>
+        <w:tabs>
+          <w:tab w:val="left" w:pos="5560"/>
+        </w:tabs>
+        <w:ind w:left="360"/>
+      </w:pPr>
+      <w:r>
+        <w:t>Le système affiche la liste</w:t>
+      </w:r>
+    </w:p>
+    <w:p>
+      <w:pPr>
+        <w:tabs>
+          <w:tab w:val="left" w:pos="5560"/>
+        </w:tabs>
+        <w:ind w:left="360"/>
+      </w:pPr>
+      <w:r>
+        <w:t>Il sélectionne une intervention</w:t>
+      </w:r>
+    </w:p>
+    <w:p>
+      <w:pPr>
+        <w:tabs>
+          <w:tab w:val="left" w:pos="5560"/>
+        </w:tabs>
+        <w:ind w:left="360"/>
+      </w:pPr>
+      <w:r>
+        <w:t>Le système affiche les détails des travaux réalisés</w:t>
+      </w:r>
+    </w:p>
+    <w:p>
+      <w:pPr>
+        <w:tabs>
+          <w:tab w:val="left" w:pos="5560"/>
+        </w:tabs>
+        <w:ind w:left="360"/>
+      </w:pPr>
+      <w:r>
+        <w:t>Il démarre les essais du véhicule</w:t>
+      </w:r>
+    </w:p>
+    <w:p>
+      <w:pPr>
+        <w:tabs>
+          <w:tab w:val="left" w:pos="5560"/>
+        </w:tabs>
+        <w:ind w:left="360"/>
+      </w:pPr>
+      <w:r>
+        <w:t>Le système confirme le démarrage</w:t>
+      </w:r>
+    </w:p>
+    <w:p>
+      <w:pPr>
+        <w:tabs>
+          <w:tab w:val="left" w:pos="5560"/>
+        </w:tabs>
+        <w:ind w:left="360"/>
+      </w:pPr>
+      <w:r>
+        <w:t>Si le véhicule est conforme :</w:t>
+      </w:r>
+    </w:p>
+    <w:p>
+      <w:pPr>
+        <w:tabs>
+          <w:tab w:val="left" w:pos="5560"/>
+        </w:tabs>
+        <w:ind w:left="360"/>
+      </w:pPr>
+      <w:r>
+        <w:lastRenderedPageBreak/>
+        <w:t>Il valide les essais</w:t>
+      </w:r>
+    </w:p>
+    <w:p>
+      <w:pPr>
+        <w:tabs>
+          <w:tab w:val="left" w:pos="5560"/>
+        </w:tabs>
+        <w:ind w:left="360"/>
+      </w:pPr>
+      <w:r>
+        <w:t>Le système enregistre la validation</w:t>
+      </w:r>
+    </w:p>
+    <w:p>
+      <w:pPr>
+        <w:tabs>
+          <w:tab w:val="left" w:pos="5560"/>
+        </w:tabs>
+        <w:ind w:left="360"/>
+      </w:pPr>
+      <w:r>
+        <w:t>Il autorise la facturation</w:t>
+      </w:r>
+    </w:p>
+    <w:p>
+      <w:pPr>
+        <w:tabs>
+          <w:tab w:val="left" w:pos="5560"/>
+        </w:tabs>
+        <w:ind w:left="360"/>
+      </w:pPr>
+      <w:r>
+        <w:t>Le système notifie le réceptionniste</w:t>
+      </w:r>
+    </w:p>
+    <w:p>
+      <w:pPr>
+        <w:tabs>
+          <w:tab w:val="left" w:pos="5560"/>
+        </w:tabs>
+        <w:ind w:left="360"/>
+      </w:pPr>
+      <w:r>
+        <w:t>Le système confirme la validation</w:t>
+      </w:r>
+    </w:p>
+    <w:p>
+      <w:pPr>
+        <w:tabs>
+          <w:tab w:val="left" w:pos="5560"/>
+        </w:tabs>
+        <w:ind w:left="360"/>
+      </w:pPr>
+      <w:r>
+        <w:t>Si le véhicule est non conforme :</w:t>
+      </w:r>
+    </w:p>
+    <w:p>
+      <w:pPr>
+        <w:tabs>
+          <w:tab w:val="left" w:pos="5560"/>
+        </w:tabs>
+        <w:ind w:left="360"/>
+      </w:pPr>
+      <w:r>
+        <w:t>Il signale la non-conformité avec un motif</w:t>
+      </w:r>
+    </w:p>
+    <w:p>
+      <w:pPr>
+        <w:tabs>
+          <w:tab w:val="left" w:pos="5560"/>
+        </w:tabs>
+        <w:ind w:left="360"/>
+      </w:pPr>
+      <w:r>
+        <w:t>Le système enregistre la non-conformité</w:t>
+      </w:r>
+    </w:p>
+    <w:p>
+      <w:pPr>
+        <w:tabs>
+          <w:tab w:val="left" w:pos="5560"/>
+        </w:tabs>
+        <w:ind w:left="360"/>
+      </w:pPr>
+      <w:r>
+        <w:t>Il demande un retour en atelier</w:t>
+      </w:r>
+    </w:p>
+    <w:p>
+      <w:pPr>
+        <w:tabs>
+          <w:tab w:val="left" w:pos="5560"/>
+        </w:tabs>
+        <w:ind w:left="360"/>
+      </w:pPr>
+      <w:r>
+        <w:t>Le système notifie le chef de département</w:t>
+      </w:r>
+    </w:p>
+    <w:p>
+      <w:pPr>
+        <w:tabs>
+          <w:tab w:val="left" w:pos="5560"/>
+        </w:tabs>
+        <w:ind w:left="360"/>
+      </w:pPr>
+      <w:r>
+        <w:t>Le système notifie le réceptionniste</w:t>
+      </w:r>
+    </w:p>
+    <w:p>
+      <w:pPr>
+        <w:tabs>
+          <w:tab w:val="left" w:pos="5560"/>
+        </w:tabs>
+        <w:ind w:left="360"/>
+      </w:pPr>
+      <w:r>
+        <w:t>Le système confirme le signalement</w:t>
+      </w:r>
+    </w:p>
+    <w:p>
+      <w:pPr>
+        <w:tabs>
+          <w:tab w:val="left" w:pos="5560"/>
+        </w:tabs>
+        <w:ind w:left="360"/>
+      </w:pPr>
+      <w:r>
+        <w:t>Le statut de l'intervention passe à "retour atelier"</w:t>
+      </w:r>
+    </w:p>
+    <w:p>
+      <w:pPr>
+        <w:tabs>
+          <w:tab w:val="left" w:pos="5560"/>
+        </w:tabs>
+        <w:ind w:left="360"/>
+        <w:rPr>
+          <w:rFonts w:ascii="Times New Roman" w:hAnsi="Times New Roman" w:cs="Times New Roman"/>
+          <w:sz w:val="24"/>
+          <w:szCs w:val="24"/>
+        </w:rPr>
+      </w:pPr>
+    </w:p>
+    <w:p>
+      <w:pPr>
+        <w:tabs>
+          <w:tab w:val="left" w:pos="5560"/>
+        </w:tabs>
+        <w:ind w:left="360"/>
+        <w:rPr>
+          <w:rFonts w:ascii="Times New Roman" w:hAnsi="Times New Roman" w:cs="Times New Roman"/>
+          <w:sz w:val="24"/>
+          <w:szCs w:val="24"/>
+        </w:rPr>
+      </w:pPr>
       <w:r>
         <w:rPr>
           <w:rFonts w:ascii="Times New Roman" w:hAnsi="Times New Roman" w:cs="Times New Roman"/>
@@ -27809,9 +28440,9 @@
         <w:lastRenderedPageBreak/>
         <w:drawing>
           <wp:inline distT="0" distB="0" distL="0" distR="0">
-            <wp:extent cx="5758512" cy="9376410"/>
-            <wp:effectExtent l="0" t="0" r="0" b="0"/>
-            <wp:docPr id="19" name="Image 19" descr="D:\l3\Memoire_De_Fin_Cycle\photo\dt.png"/>
+            <wp:extent cx="5760720" cy="8835576"/>
+            <wp:effectExtent l="0" t="0" r="0" b="3810"/>
+            <wp:docPr id="21" name="Image 21" descr="D:\l3\Memoire_De_Fin_Cycle\photo\cdpt1.png"/>
             <wp:cNvGraphicFramePr>
               <a:graphicFrameLocks xmlns:a="http://schemas.openxmlformats.org/drawingml/2006/main" noChangeAspect="1"/>
             </wp:cNvGraphicFramePr>
@@ -27819,13 +28450,13 @@
               <a:graphicData uri="http://schemas.openxmlformats.org/drawingml/2006/picture">
                 <pic:pic xmlns:pic="http://schemas.openxmlformats.org/drawingml/2006/picture">
                   <pic:nvPicPr>
-                    <pic:cNvPr id="0" name="Picture 10" descr="D:\l3\Memoire_De_Fin_Cycle\photo\dt.png"/>
+                    <pic:cNvPr id="0" name="Picture 9" descr="D:\l3\Memoire_De_Fin_Cycle\photo\cdpt1.png"/>
                     <pic:cNvPicPr>
                       <a:picLocks noChangeAspect="1" noChangeArrowheads="1"/>
                     </pic:cNvPicPr>
                   </pic:nvPicPr>
                   <pic:blipFill>
-                    <a:blip r:embed="rId18">
+                    <a:blip r:embed="rId19">
                       <a:extLst>
                         <a:ext uri="{28A0092B-C50C-407E-A947-70E740481C1C}">
                           <a14:useLocalDpi xmlns:a14="http://schemas.microsoft.com/office/drawing/2010/main" val="0"/>
@@ -27840,7 +28471,7 @@
                   <pic:spPr bwMode="auto">
                     <a:xfrm>
                       <a:off x="0" y="0"/>
-                      <a:ext cx="5772235" cy="9398754"/>
+                      <a:ext cx="5760720" cy="8835576"/>
                     </a:xfrm>
                     <a:prstGeom prst="rect">
                       <a:avLst/>
@@ -27859,295 +28490,6 @@
     </w:p>
     <w:p>
       <w:pPr>
-        <w:tabs>
-          <w:tab w:val="left" w:pos="5560"/>
-        </w:tabs>
-        <w:ind w:left="360"/>
-        <w:rPr>
-          <w:rFonts w:ascii="Times New Roman" w:hAnsi="Times New Roman" w:cs="Times New Roman"/>
-          <w:sz w:val="24"/>
-          <w:szCs w:val="24"/>
-        </w:rPr>
-      </w:pPr>
-    </w:p>
-    <w:p>
-      <w:pPr>
-        <w:tabs>
-          <w:tab w:val="left" w:pos="5560"/>
-        </w:tabs>
-        <w:ind w:left="360"/>
-        <w:rPr>
-          <w:rFonts w:ascii="Times New Roman" w:hAnsi="Times New Roman" w:cs="Times New Roman"/>
-          <w:sz w:val="24"/>
-          <w:szCs w:val="24"/>
-        </w:rPr>
-      </w:pPr>
-      <w:r>
-        <w:rPr>
-          <w:rFonts w:ascii="Times New Roman" w:hAnsi="Times New Roman" w:cs="Times New Roman"/>
-          <w:sz w:val="24"/>
-          <w:szCs w:val="24"/>
-        </w:rPr>
-        <w:t>Description :</w:t>
-      </w:r>
-    </w:p>
-    <w:p>
-      <w:pPr>
-        <w:tabs>
-          <w:tab w:val="left" w:pos="5560"/>
-        </w:tabs>
-        <w:ind w:left="360"/>
-      </w:pPr>
-      <w:r>
-        <w:t>Le directeur technique (ou chef de département) saisit ses identifiants</w:t>
-      </w:r>
-    </w:p>
-    <w:p>
-      <w:pPr>
-        <w:tabs>
-          <w:tab w:val="left" w:pos="5560"/>
-        </w:tabs>
-        <w:ind w:left="360"/>
-      </w:pPr>
-      <w:r>
-        <w:t>Le système lui accorde l'accès</w:t>
-      </w:r>
-    </w:p>
-    <w:p>
-      <w:pPr>
-        <w:tabs>
-          <w:tab w:val="left" w:pos="5560"/>
-        </w:tabs>
-        <w:ind w:left="360"/>
-      </w:pPr>
-      <w:r>
-        <w:t>Il consulte la liste des interventions terminées</w:t>
-      </w:r>
-    </w:p>
-    <w:p>
-      <w:pPr>
-        <w:tabs>
-          <w:tab w:val="left" w:pos="5560"/>
-        </w:tabs>
-        <w:ind w:left="360"/>
-      </w:pPr>
-      <w:r>
-        <w:t>Le système affiche la liste</w:t>
-      </w:r>
-    </w:p>
-    <w:p>
-      <w:pPr>
-        <w:tabs>
-          <w:tab w:val="left" w:pos="5560"/>
-        </w:tabs>
-        <w:ind w:left="360"/>
-      </w:pPr>
-      <w:r>
-        <w:t>Il sélectionne une intervention</w:t>
-      </w:r>
-    </w:p>
-    <w:p>
-      <w:pPr>
-        <w:tabs>
-          <w:tab w:val="left" w:pos="5560"/>
-        </w:tabs>
-        <w:ind w:left="360"/>
-      </w:pPr>
-      <w:r>
-        <w:t>Le système affiche les détails des travaux réalisés</w:t>
-      </w:r>
-    </w:p>
-    <w:p>
-      <w:pPr>
-        <w:tabs>
-          <w:tab w:val="left" w:pos="5560"/>
-        </w:tabs>
-        <w:ind w:left="360"/>
-      </w:pPr>
-      <w:r>
-        <w:t>Il démarre les essais du véhicule</w:t>
-      </w:r>
-    </w:p>
-    <w:p>
-      <w:pPr>
-        <w:tabs>
-          <w:tab w:val="left" w:pos="5560"/>
-        </w:tabs>
-        <w:ind w:left="360"/>
-      </w:pPr>
-      <w:r>
-        <w:t>Le système confirme le démarrage</w:t>
-      </w:r>
-    </w:p>
-    <w:p>
-      <w:pPr>
-        <w:tabs>
-          <w:tab w:val="left" w:pos="5560"/>
-        </w:tabs>
-        <w:ind w:left="360"/>
-      </w:pPr>
-      <w:r>
-        <w:t>Si le véhicule est conforme :</w:t>
-      </w:r>
-    </w:p>
-    <w:p>
-      <w:pPr>
-        <w:tabs>
-          <w:tab w:val="left" w:pos="5560"/>
-        </w:tabs>
-        <w:ind w:left="360"/>
-      </w:pPr>
-      <w:r>
-        <w:t>Il valide les essais</w:t>
-      </w:r>
-    </w:p>
-    <w:p>
-      <w:pPr>
-        <w:tabs>
-          <w:tab w:val="left" w:pos="5560"/>
-        </w:tabs>
-        <w:ind w:left="360"/>
-      </w:pPr>
-      <w:r>
-        <w:t>Le système enregistre la validation</w:t>
-      </w:r>
-    </w:p>
-    <w:p>
-      <w:pPr>
-        <w:tabs>
-          <w:tab w:val="left" w:pos="5560"/>
-        </w:tabs>
-        <w:ind w:left="360"/>
-      </w:pPr>
-      <w:r>
-        <w:t>Il autorise la facturation</w:t>
-      </w:r>
-    </w:p>
-    <w:p>
-      <w:pPr>
-        <w:tabs>
-          <w:tab w:val="left" w:pos="5560"/>
-        </w:tabs>
-        <w:ind w:left="360"/>
-      </w:pPr>
-      <w:r>
-        <w:t>Le système notifie le réceptionniste</w:t>
-      </w:r>
-    </w:p>
-    <w:p>
-      <w:pPr>
-        <w:tabs>
-          <w:tab w:val="left" w:pos="5560"/>
-        </w:tabs>
-        <w:ind w:left="360"/>
-      </w:pPr>
-      <w:r>
-        <w:t>Le système confirme la validation</w:t>
-      </w:r>
-    </w:p>
-    <w:p>
-      <w:pPr>
-        <w:tabs>
-          <w:tab w:val="left" w:pos="5560"/>
-        </w:tabs>
-        <w:ind w:left="360"/>
-      </w:pPr>
-      <w:r>
-        <w:t>Si le véhicule est non conforme :</w:t>
-      </w:r>
-    </w:p>
-    <w:p>
-      <w:pPr>
-        <w:tabs>
-          <w:tab w:val="left" w:pos="5560"/>
-        </w:tabs>
-        <w:ind w:left="360"/>
-      </w:pPr>
-      <w:r>
-        <w:t>Il signale la non-conformité avec un motif</w:t>
-      </w:r>
-    </w:p>
-    <w:p>
-      <w:pPr>
-        <w:tabs>
-          <w:tab w:val="left" w:pos="5560"/>
-        </w:tabs>
-        <w:ind w:left="360"/>
-      </w:pPr>
-      <w:r>
-        <w:t>Le système enregistre la non-conformité</w:t>
-      </w:r>
-    </w:p>
-    <w:p>
-      <w:pPr>
-        <w:tabs>
-          <w:tab w:val="left" w:pos="5560"/>
-        </w:tabs>
-        <w:ind w:left="360"/>
-      </w:pPr>
-      <w:r>
-        <w:t>Il demande un retour en atelier</w:t>
-      </w:r>
-    </w:p>
-    <w:p>
-      <w:pPr>
-        <w:tabs>
-          <w:tab w:val="left" w:pos="5560"/>
-        </w:tabs>
-        <w:ind w:left="360"/>
-      </w:pPr>
-      <w:r>
-        <w:t>Le système notifie le chef de département</w:t>
-      </w:r>
-    </w:p>
-    <w:p>
-      <w:pPr>
-        <w:tabs>
-          <w:tab w:val="left" w:pos="5560"/>
-        </w:tabs>
-        <w:ind w:left="360"/>
-      </w:pPr>
-      <w:r>
-        <w:t>Le système notifie le réceptionniste</w:t>
-      </w:r>
-    </w:p>
-    <w:p>
-      <w:pPr>
-        <w:tabs>
-          <w:tab w:val="left" w:pos="5560"/>
-        </w:tabs>
-        <w:ind w:left="360"/>
-      </w:pPr>
-      <w:r>
-        <w:t>Le système confirme le signalement</w:t>
-      </w:r>
-    </w:p>
-    <w:p>
-      <w:pPr>
-        <w:tabs>
-          <w:tab w:val="left" w:pos="5560"/>
-        </w:tabs>
-        <w:ind w:left="360"/>
-      </w:pPr>
-      <w:r>
-        <w:t>Le statut de l'intervention passe à "retour atelier"</w:t>
-      </w:r>
-    </w:p>
-    <w:p>
-      <w:pPr>
-        <w:tabs>
-          <w:tab w:val="left" w:pos="5560"/>
-        </w:tabs>
-        <w:ind w:left="360"/>
-        <w:rPr>
-          <w:rFonts w:ascii="Times New Roman" w:hAnsi="Times New Roman" w:cs="Times New Roman"/>
-          <w:sz w:val="24"/>
-          <w:szCs w:val="24"/>
-        </w:rPr>
-      </w:pPr>
-    </w:p>
-    <w:p>
-      <w:pPr>
         <w:pStyle w:val="Paragraphedeliste"/>
         <w:numPr>
           <w:ilvl w:val="1"/>
@@ -28168,6 +28510,7 @@
           <w:sz w:val="24"/>
           <w:szCs w:val="24"/>
         </w:rPr>
+        <w:lastRenderedPageBreak/>
         <w:t>Diagramme de cas</w:t>
       </w:r>
       <w:r>
@@ -28227,7 +28570,6 @@
           <w:szCs w:val="24"/>
           <w:lang w:eastAsia="fr-FR"/>
         </w:rPr>
-        <w:lastRenderedPageBreak/>
         <w:drawing>
           <wp:inline distT="0" distB="0" distL="0" distR="0">
             <wp:extent cx="5760720" cy="4381096"/>
@@ -28246,7 +28588,7 @@
                     </pic:cNvPicPr>
                   </pic:nvPicPr>
                   <pic:blipFill>
-                    <a:blip r:embed="rId19">
+                    <a:blip r:embed="rId20">
                       <a:extLst>
                         <a:ext uri="{28A0092B-C50C-407E-A947-70E740481C1C}">
                           <a14:useLocalDpi xmlns:a14="http://schemas.microsoft.com/office/drawing/2010/main" val="0"/>
@@ -28336,9 +28678,9 @@
         <w:lastRenderedPageBreak/>
         <w:drawing>
           <wp:inline distT="0" distB="0" distL="0" distR="0">
-            <wp:extent cx="6026150" cy="9613900"/>
-            <wp:effectExtent l="0" t="0" r="0" b="6350"/>
-            <wp:docPr id="12" name="Image 12" descr="D:\l3\Memoire_De_Fin_Cycle\photo\admin.png"/>
+            <wp:extent cx="5058137" cy="8964295"/>
+            <wp:effectExtent l="0" t="0" r="9525" b="8255"/>
+            <wp:docPr id="23" name="Image 23" descr="D:\l3\Memoire_De_Fin_Cycle\photo\adm2.png"/>
             <wp:cNvGraphicFramePr>
               <a:graphicFrameLocks xmlns:a="http://schemas.openxmlformats.org/drawingml/2006/main" noChangeAspect="1"/>
             </wp:cNvGraphicFramePr>
@@ -28346,78 +28688,7 @@
               <a:graphicData uri="http://schemas.openxmlformats.org/drawingml/2006/picture">
                 <pic:pic xmlns:pic="http://schemas.openxmlformats.org/drawingml/2006/picture">
                   <pic:nvPicPr>
-                    <pic:cNvPr id="0" name="Picture 4" descr="D:\l3\Memoire_De_Fin_Cycle\photo\admin.png"/>
-                    <pic:cNvPicPr>
-                      <a:picLocks noChangeAspect="1" noChangeArrowheads="1"/>
-                    </pic:cNvPicPr>
-                  </pic:nvPicPr>
-                  <pic:blipFill>
-                    <a:blip r:embed="rId20">
-                      <a:extLst>
-                        <a:ext uri="{28A0092B-C50C-407E-A947-70E740481C1C}">
-                          <a14:useLocalDpi xmlns:a14="http://schemas.microsoft.com/office/drawing/2010/main" val="0"/>
-                        </a:ext>
-                      </a:extLst>
-                    </a:blip>
-                    <a:srcRect/>
-                    <a:stretch>
-                      <a:fillRect/>
-                    </a:stretch>
-                  </pic:blipFill>
-                  <pic:spPr bwMode="auto">
-                    <a:xfrm>
-                      <a:off x="0" y="0"/>
-                      <a:ext cx="6026150" cy="9613900"/>
-                    </a:xfrm>
-                    <a:prstGeom prst="rect">
-                      <a:avLst/>
-                    </a:prstGeom>
-                    <a:noFill/>
-                    <a:ln>
-                      <a:noFill/>
-                    </a:ln>
-                  </pic:spPr>
-                </pic:pic>
-              </a:graphicData>
-            </a:graphic>
-          </wp:inline>
-        </w:drawing>
-      </w:r>
-    </w:p>
-    <w:p>
-      <w:pPr>
-        <w:tabs>
-          <w:tab w:val="left" w:pos="5560"/>
-        </w:tabs>
-        <w:ind w:left="360"/>
-        <w:rPr>
-          <w:rFonts w:ascii="Times New Roman" w:hAnsi="Times New Roman" w:cs="Times New Roman"/>
-          <w:sz w:val="24"/>
-          <w:szCs w:val="24"/>
-        </w:rPr>
-      </w:pPr>
-      <w:r>
-        <w:rPr>
-          <w:rFonts w:ascii="Times New Roman" w:hAnsi="Times New Roman" w:cs="Times New Roman"/>
-          <w:noProof/>
-          <w:sz w:val="24"/>
-          <w:szCs w:val="24"/>
-          <w:lang w:eastAsia="fr-FR"/>
-        </w:rPr>
-        <w:lastRenderedPageBreak/>
-        <w:drawing>
-          <wp:inline distT="0" distB="0" distL="0" distR="0">
-            <wp:extent cx="5295900" cy="8947150"/>
-            <wp:effectExtent l="0" t="0" r="0" b="6350"/>
-            <wp:docPr id="13" name="Image 13" descr="D:\l3\Memoire_De_Fin_Cycle\photo\admin1.png"/>
-            <wp:cNvGraphicFramePr>
-              <a:graphicFrameLocks xmlns:a="http://schemas.openxmlformats.org/drawingml/2006/main" noChangeAspect="1"/>
-            </wp:cNvGraphicFramePr>
-            <a:graphic xmlns:a="http://schemas.openxmlformats.org/drawingml/2006/main">
-              <a:graphicData uri="http://schemas.openxmlformats.org/drawingml/2006/picture">
-                <pic:pic xmlns:pic="http://schemas.openxmlformats.org/drawingml/2006/picture">
-                  <pic:nvPicPr>
-                    <pic:cNvPr id="0" name="Picture 5" descr="D:\l3\Memoire_De_Fin_Cycle\photo\admin1.png"/>
+                    <pic:cNvPr id="0" name="Picture 11" descr="D:\l3\Memoire_De_Fin_Cycle\photo\adm2.png"/>
                     <pic:cNvPicPr>
                       <a:picLocks noChangeAspect="1" noChangeArrowheads="1"/>
                     </pic:cNvPicPr>
@@ -28438,7 +28709,7 @@
                   <pic:spPr bwMode="auto">
                     <a:xfrm>
                       <a:off x="0" y="0"/>
-                      <a:ext cx="5295900" cy="8947150"/>
+                      <a:ext cx="5060607" cy="8968673"/>
                     </a:xfrm>
                     <a:prstGeom prst="rect">
                       <a:avLst/>
@@ -28457,6 +28728,90 @@
     </w:p>
     <w:p>
       <w:pPr>
+        <w:tabs>
+          <w:tab w:val="left" w:pos="5560"/>
+        </w:tabs>
+        <w:ind w:left="360"/>
+        <w:rPr>
+          <w:rFonts w:ascii="Times New Roman" w:hAnsi="Times New Roman" w:cs="Times New Roman"/>
+          <w:sz w:val="24"/>
+          <w:szCs w:val="24"/>
+        </w:rPr>
+      </w:pPr>
+      <w:r>
+        <w:rPr>
+          <w:rFonts w:ascii="Times New Roman" w:hAnsi="Times New Roman" w:cs="Times New Roman"/>
+          <w:noProof/>
+          <w:sz w:val="24"/>
+          <w:szCs w:val="24"/>
+          <w:lang w:eastAsia="fr-FR"/>
+        </w:rPr>
+        <w:lastRenderedPageBreak/>
+        <w:drawing>
+          <wp:inline distT="0" distB="0" distL="0" distR="0">
+            <wp:extent cx="5376440" cy="7418494"/>
+            <wp:effectExtent l="0" t="0" r="0" b="0"/>
+            <wp:docPr id="22" name="Image 22" descr="D:\l3\Memoire_De_Fin_Cycle\photo\ad1.png"/>
+            <wp:cNvGraphicFramePr>
+              <a:graphicFrameLocks xmlns:a="http://schemas.openxmlformats.org/drawingml/2006/main" noChangeAspect="1"/>
+            </wp:cNvGraphicFramePr>
+            <a:graphic xmlns:a="http://schemas.openxmlformats.org/drawingml/2006/main">
+              <a:graphicData uri="http://schemas.openxmlformats.org/drawingml/2006/picture">
+                <pic:pic xmlns:pic="http://schemas.openxmlformats.org/drawingml/2006/picture">
+                  <pic:nvPicPr>
+                    <pic:cNvPr id="0" name="Picture 10" descr="D:\l3\Memoire_De_Fin_Cycle\photo\ad1.png"/>
+                    <pic:cNvPicPr>
+                      <a:picLocks noChangeAspect="1" noChangeArrowheads="1"/>
+                    </pic:cNvPicPr>
+                  </pic:nvPicPr>
+                  <pic:blipFill>
+                    <a:blip r:embed="rId22">
+                      <a:extLst>
+                        <a:ext uri="{28A0092B-C50C-407E-A947-70E740481C1C}">
+                          <a14:useLocalDpi xmlns:a14="http://schemas.microsoft.com/office/drawing/2010/main" val="0"/>
+                        </a:ext>
+                      </a:extLst>
+                    </a:blip>
+                    <a:srcRect/>
+                    <a:stretch>
+                      <a:fillRect/>
+                    </a:stretch>
+                  </pic:blipFill>
+                  <pic:spPr bwMode="auto">
+                    <a:xfrm>
+                      <a:off x="0" y="0"/>
+                      <a:ext cx="5386350" cy="7432168"/>
+                    </a:xfrm>
+                    <a:prstGeom prst="rect">
+                      <a:avLst/>
+                    </a:prstGeom>
+                    <a:noFill/>
+                    <a:ln>
+                      <a:noFill/>
+                    </a:ln>
+                  </pic:spPr>
+                </pic:pic>
+              </a:graphicData>
+            </a:graphic>
+          </wp:inline>
+        </w:drawing>
+      </w:r>
+    </w:p>
+    <w:p>
+      <w:pPr>
+        <w:tabs>
+          <w:tab w:val="left" w:pos="5560"/>
+        </w:tabs>
+        <w:ind w:left="360"/>
+        <w:rPr>
+          <w:rFonts w:ascii="Times New Roman" w:hAnsi="Times New Roman" w:cs="Times New Roman"/>
+          <w:sz w:val="24"/>
+          <w:szCs w:val="24"/>
+        </w:rPr>
+      </w:pPr>
+    </w:p>
+    <w:p>
+      <w:pPr>
         <w:pStyle w:val="Paragraphedeliste"/>
         <w:numPr>
           <w:ilvl w:val="0"/>
@@ -28477,7 +28832,6 @@
           <w:sz w:val="24"/>
           <w:szCs w:val="24"/>
         </w:rPr>
-        <w:lastRenderedPageBreak/>
         <w:t>Diagramme de séquence</w:t>
       </w:r>
     </w:p>
@@ -28494,6 +28848,91 @@
           <w:szCs w:val="24"/>
         </w:rPr>
       </w:pPr>
+    </w:p>
+    <w:p>
+      <w:pPr>
+        <w:spacing w:before="100" w:beforeAutospacing="1" w:after="100" w:afterAutospacing="1" w:line="240" w:lineRule="auto"/>
+        <w:rPr>
+          <w:rFonts w:ascii="Times New Roman" w:eastAsia="Times New Roman" w:hAnsi="Times New Roman" w:cs="Times New Roman"/>
+          <w:sz w:val="24"/>
+          <w:szCs w:val="24"/>
+          <w:lang w:eastAsia="fr-FR"/>
+        </w:rPr>
+      </w:pPr>
+      <w:r>
+        <w:rPr>
+          <w:rFonts w:ascii="Times New Roman" w:eastAsia="Times New Roman" w:hAnsi="Times New Roman" w:cs="Times New Roman"/>
+          <w:noProof/>
+          <w:sz w:val="24"/>
+          <w:szCs w:val="24"/>
+          <w:lang w:eastAsia="fr-FR"/>
+        </w:rPr>
+        <w:lastRenderedPageBreak/>
+        <w:drawing>
+          <wp:inline distT="0" distB="0" distL="0" distR="0">
+            <wp:extent cx="6436387" cy="5533101"/>
+            <wp:effectExtent l="0" t="0" r="2540" b="0"/>
+            <wp:docPr id="3" name="Image 3" descr="D:\l3\Memoire_De_Fin_Cycle\dClasse.drawio.png"/>
+            <wp:cNvGraphicFramePr>
+              <a:graphicFrameLocks xmlns:a="http://schemas.openxmlformats.org/drawingml/2006/main" noChangeAspect="1"/>
+            </wp:cNvGraphicFramePr>
+            <a:graphic xmlns:a="http://schemas.openxmlformats.org/drawingml/2006/main">
+              <a:graphicData uri="http://schemas.openxmlformats.org/drawingml/2006/picture">
+                <pic:pic xmlns:pic="http://schemas.openxmlformats.org/drawingml/2006/picture">
+                  <pic:nvPicPr>
+                    <pic:cNvPr id="0" name="Picture 2" descr="D:\l3\Memoire_De_Fin_Cycle\dClasse.drawio.png"/>
+                    <pic:cNvPicPr>
+                      <a:picLocks noChangeAspect="1" noChangeArrowheads="1"/>
+                    </pic:cNvPicPr>
+                  </pic:nvPicPr>
+                  <pic:blipFill>
+                    <a:blip r:embed="rId23" cstate="print">
+                      <a:extLst>
+                        <a:ext uri="{28A0092B-C50C-407E-A947-70E740481C1C}">
+                          <a14:useLocalDpi xmlns:a14="http://schemas.microsoft.com/office/drawing/2010/main" val="0"/>
+                        </a:ext>
+                      </a:extLst>
+                    </a:blip>
+                    <a:srcRect/>
+                    <a:stretch>
+                      <a:fillRect/>
+                    </a:stretch>
+                  </pic:blipFill>
+                  <pic:spPr bwMode="auto">
+                    <a:xfrm>
+                      <a:off x="0" y="0"/>
+                      <a:ext cx="6449463" cy="5544342"/>
+                    </a:xfrm>
+                    <a:prstGeom prst="rect">
+                      <a:avLst/>
+                    </a:prstGeom>
+                    <a:noFill/>
+                    <a:ln>
+                      <a:noFill/>
+                    </a:ln>
+                  </pic:spPr>
+                </pic:pic>
+              </a:graphicData>
+            </a:graphic>
+          </wp:inline>
+        </w:drawing>
+      </w:r>
+    </w:p>
+    <w:p>
+      <w:pPr>
+        <w:pStyle w:val="Paragraphedeliste"/>
+        <w:tabs>
+          <w:tab w:val="left" w:pos="5560"/>
+        </w:tabs>
+        <w:ind w:left="1080"/>
+        <w:rPr>
+          <w:rFonts w:ascii="Times New Roman" w:hAnsi="Times New Roman" w:cs="Times New Roman"/>
+          <w:sz w:val="24"/>
+          <w:szCs w:val="24"/>
+        </w:rPr>
+      </w:pPr>
+      <w:bookmarkStart w:id="0" w:name="_GoBack"/>
+      <w:bookmarkEnd w:id="0"/>
     </w:p>
     <w:p>
       <w:pPr>
@@ -28590,7 +29029,7 @@
         <v:path o:extrusionok="f" gradientshapeok="t" o:connecttype="rect"/>
         <o:lock v:ext="edit" aspectratio="t"/>
       </v:shapetype>
-      <v:shape id="_x0000_i1038" type="#_x0000_t75" style="width:11.5pt;height:11.5pt" o:bullet="t">
+      <v:shape id="_x0000_i1027" type="#_x0000_t75" style="width:11.4pt;height:11.4pt" o:bullet="t">
         <v:imagedata r:id="rId1" o:title="mso3B8"/>
       </v:shape>
     </w:pict>
@@ -33215,7 +33654,7 @@
 </file>
 
 <file path=customXml/itemProps1.xml><?xml version="1.0" encoding="utf-8"?>
-<ds:datastoreItem xmlns:ds="http://schemas.openxmlformats.org/officeDocument/2006/customXml" ds:itemID="{95A71247-AAE0-4A17-AF37-27E6676B7B19}">
+<ds:datastoreItem xmlns:ds="http://schemas.openxmlformats.org/officeDocument/2006/customXml" ds:itemID="{1FA90143-A869-4524-9B6D-C22535A53D5A}">
   <ds:schemaRefs>
     <ds:schemaRef ds:uri="http://schemas.openxmlformats.org/officeDocument/2006/bibliography"/>
   </ds:schemaRefs>

</xml_diff>